<commit_message>
Add thesis document with Chapter 1 complete
</commit_message>
<xml_diff>
--- a/docs/BusaniNcube-Thesis.docx
+++ b/docs/BusaniNcube-Thesis.docx
@@ -1237,6 +1237,18 @@
       </w:r>
     </w:p>
     <w:p>
+      <w:r>
+        <w:rPr>
+          <w:rFonts w:ascii="Times New Roman" w:hAnsi="Times New Roman" w:eastAsia="Times New Roman" w:cs="Times New Roman"/>
+          <w:noProof w:val="0"/>
+          <w:sz w:val="22"/>
+          <w:szCs w:val="22"/>
+          <w:lang w:val="en-GB"/>
+        </w:rPr>
+        <w:t>This project addresses these challenges by creating a low-cost, multi-interface smart home controller built around a Raspberry Pi 4 running Home Assistant, an ESP32 microcontroller for sensor integration via MQTT, and an ESP32-S3 paired with a Grove Vision AI V2 module for on-device artificial intelligence vision detection. Together with a Waveshare touchscreen for local control, the system demonstrates that a fully functional, AI-enhanced smart home platform can be built affordably without dependence on costly commercial alternatives.</w:t>
+      </w:r>
+    </w:p>
+    <w:p>
       <w:pPr>
         <w:pStyle w:val="Normal"/>
         <w:spacing w:before="240" w:beforeAutospacing="off" w:after="240" w:afterAutospacing="off"/>
@@ -1248,36 +1260,6 @@
           <w:lang w:val="en-GB"/>
         </w:rPr>
       </w:pPr>
-      <w:r>
-        <w:rPr>
-          <w:rFonts w:ascii="Times New Roman" w:hAnsi="Times New Roman" w:eastAsia="Times New Roman" w:cs="Times New Roman"/>
-          <w:noProof w:val="0"/>
-          <w:sz w:val="22"/>
-          <w:szCs w:val="22"/>
-          <w:lang w:val="en-GB"/>
-        </w:rPr>
-        <w:t xml:space="preserve">This project addresses these challenges by creating a low-cost smart home controller using a Raspberry Pi, with Home Assistant serving as an accessible and affordable alternative to </w:t>
-      </w:r>
-      <w:r>
-        <w:rPr>
-          <w:rFonts w:ascii="Times New Roman" w:hAnsi="Times New Roman" w:eastAsia="Times New Roman" w:cs="Times New Roman"/>
-          <w:noProof w:val="0"/>
-          <w:sz w:val="22"/>
-          <w:szCs w:val="22"/>
-          <w:lang w:val="en-GB"/>
-        </w:rPr>
-        <w:t>high priced</w:t>
-      </w:r>
-      <w:r>
-        <w:rPr>
-          <w:rFonts w:ascii="Times New Roman" w:hAnsi="Times New Roman" w:eastAsia="Times New Roman" w:cs="Times New Roman"/>
-          <w:noProof w:val="0"/>
-          <w:sz w:val="22"/>
-          <w:szCs w:val="22"/>
-          <w:lang w:val="en-GB"/>
-        </w:rPr>
-        <w:t xml:space="preserve"> commercial systems.</w:t>
-      </w:r>
     </w:p>
     <w:p>
       <w:pPr>
@@ -1803,203 +1785,16 @@
         <w:pStyle w:val="Normal"/>
         <w:spacing w:before="240" w:beforeAutospacing="off" w:after="240" w:afterAutospacing="off"/>
         <w:jc w:val="left"/>
-        <w:rPr>
-          <w:rFonts w:ascii="Aptos" w:hAnsi="Aptos" w:eastAsia="Aptos" w:cs="Aptos"/>
-          <w:noProof w:val="0"/>
-          <w:sz w:val="24"/>
-          <w:szCs w:val="24"/>
-          <w:lang w:val="en-GB"/>
-        </w:rPr>
-      </w:pPr>
-      <w:r>
-        <w:rPr>
-          <w:rFonts w:ascii="Times New Roman" w:hAnsi="Times New Roman" w:eastAsia="Times New Roman" w:cs="Times New Roman"/>
-          <w:noProof w:val="0"/>
-          <w:sz w:val="22"/>
-          <w:szCs w:val="22"/>
-          <w:lang w:val="en-GB"/>
-        </w:rPr>
-        <w:t xml:space="preserve">The aim of this project is to design and build a low-cost smart home automation system using a Raspberry Pi 4 and Home Assistant. </w:t>
-      </w:r>
-      <w:r>
-        <w:rPr>
-          <w:rFonts w:ascii="Times New Roman" w:hAnsi="Times New Roman" w:eastAsia="Times New Roman" w:cs="Times New Roman"/>
-          <w:noProof w:val="0"/>
-          <w:sz w:val="22"/>
-          <w:szCs w:val="22"/>
-          <w:lang w:val="en-GB"/>
-        </w:rPr>
-        <w:t xml:space="preserve">The system uses different sensors and actuators, including a DHT22 temperature and humidity sensor, a PIR motion sensor, a relay module, and an SG90 servo motor, to </w:t>
-      </w:r>
-      <w:r>
-        <w:rPr>
-          <w:rFonts w:ascii="Times New Roman" w:hAnsi="Times New Roman" w:eastAsia="Times New Roman" w:cs="Times New Roman"/>
-          <w:noProof w:val="0"/>
-          <w:sz w:val="22"/>
-          <w:szCs w:val="22"/>
-          <w:lang w:val="en-GB"/>
-        </w:rPr>
-        <w:t>monitor</w:t>
-      </w:r>
-      <w:r>
-        <w:rPr>
-          <w:rFonts w:ascii="Times New Roman" w:hAnsi="Times New Roman" w:eastAsia="Times New Roman" w:cs="Times New Roman"/>
-          <w:noProof w:val="0"/>
-          <w:sz w:val="22"/>
-          <w:szCs w:val="22"/>
-          <w:lang w:val="en-GB"/>
-        </w:rPr>
-        <w:t xml:space="preserve"> and automate home functions like temperature, motion detection, device control, and door locking.</w:t>
-      </w:r>
-      <w:r>
-        <w:rPr>
-          <w:rFonts w:ascii="Times New Roman" w:hAnsi="Times New Roman" w:eastAsia="Times New Roman" w:cs="Times New Roman"/>
-          <w:noProof w:val="0"/>
-          <w:sz w:val="22"/>
-          <w:szCs w:val="22"/>
-          <w:lang w:val="en-GB"/>
-        </w:rPr>
-        <w:t xml:space="preserve"> </w:t>
-      </w:r>
-      <w:r>
-        <w:rPr>
-          <w:rFonts w:ascii="Times New Roman" w:hAnsi="Times New Roman" w:eastAsia="Times New Roman" w:cs="Times New Roman"/>
-          <w:noProof w:val="0"/>
-          <w:sz w:val="22"/>
-          <w:szCs w:val="22"/>
-          <w:lang w:val="en-GB"/>
-        </w:rPr>
-        <w:t xml:space="preserve">The </w:t>
-      </w:r>
-      <w:r>
-        <w:rPr>
-          <w:rFonts w:ascii="Times New Roman" w:hAnsi="Times New Roman" w:eastAsia="Times New Roman" w:cs="Times New Roman"/>
-          <w:noProof w:val="0"/>
-          <w:sz w:val="22"/>
-          <w:szCs w:val="22"/>
-          <w:lang w:val="en-GB"/>
-        </w:rPr>
-        <w:t>completed</w:t>
-      </w:r>
-      <w:r>
-        <w:rPr>
-          <w:rFonts w:ascii="Times New Roman" w:hAnsi="Times New Roman" w:eastAsia="Times New Roman" w:cs="Times New Roman"/>
-          <w:noProof w:val="0"/>
-          <w:sz w:val="22"/>
-          <w:szCs w:val="22"/>
-          <w:lang w:val="en-GB"/>
-        </w:rPr>
-        <w:t xml:space="preserve"> system can be accessed through a dashboard on any smartphone or browser, </w:t>
-      </w:r>
-      <w:r>
-        <w:rPr>
-          <w:rFonts w:ascii="Times New Roman" w:hAnsi="Times New Roman" w:eastAsia="Times New Roman" w:cs="Times New Roman"/>
-          <w:noProof w:val="0"/>
-          <w:sz w:val="22"/>
-          <w:szCs w:val="22"/>
-          <w:lang w:val="en-GB"/>
-        </w:rPr>
-        <w:t>showing</w:t>
-      </w:r>
-      <w:r>
-        <w:rPr>
-          <w:rFonts w:ascii="Times New Roman" w:hAnsi="Times New Roman" w:eastAsia="Times New Roman" w:cs="Times New Roman"/>
-          <w:noProof w:val="0"/>
-          <w:sz w:val="22"/>
-          <w:szCs w:val="22"/>
-          <w:lang w:val="en-GB"/>
-        </w:rPr>
-        <w:t xml:space="preserve"> </w:t>
-      </w:r>
-      <w:r>
-        <w:rPr>
-          <w:rFonts w:ascii="Times New Roman" w:hAnsi="Times New Roman" w:eastAsia="Times New Roman" w:cs="Times New Roman"/>
-          <w:noProof w:val="0"/>
-          <w:sz w:val="22"/>
-          <w:szCs w:val="22"/>
-          <w:lang w:val="en-GB"/>
-        </w:rPr>
-        <w:t xml:space="preserve">that </w:t>
-      </w:r>
-      <w:r>
-        <w:rPr>
-          <w:rFonts w:ascii="Times New Roman" w:hAnsi="Times New Roman" w:eastAsia="Times New Roman" w:cs="Times New Roman"/>
-          <w:noProof w:val="0"/>
-          <w:sz w:val="22"/>
-          <w:szCs w:val="22"/>
-          <w:lang w:val="en-GB"/>
-        </w:rPr>
-        <w:t xml:space="preserve">a fully functional smart home setup </w:t>
-      </w:r>
-      <w:r>
-        <w:rPr>
-          <w:rFonts w:ascii="Times New Roman" w:hAnsi="Times New Roman" w:eastAsia="Times New Roman" w:cs="Times New Roman"/>
-          <w:noProof w:val="0"/>
-          <w:sz w:val="22"/>
-          <w:szCs w:val="22"/>
-          <w:lang w:val="en-GB"/>
-        </w:rPr>
-        <w:t xml:space="preserve">can </w:t>
-      </w:r>
-      <w:r>
-        <w:rPr>
-          <w:rFonts w:ascii="Times New Roman" w:hAnsi="Times New Roman" w:eastAsia="Times New Roman" w:cs="Times New Roman"/>
-          <w:noProof w:val="0"/>
-          <w:sz w:val="22"/>
-          <w:szCs w:val="22"/>
-          <w:lang w:val="en-GB"/>
-        </w:rPr>
-        <w:t xml:space="preserve">be </w:t>
-      </w:r>
-      <w:r>
-        <w:rPr>
-          <w:rFonts w:ascii="Times New Roman" w:hAnsi="Times New Roman" w:eastAsia="Times New Roman" w:cs="Times New Roman"/>
-          <w:noProof w:val="0"/>
-          <w:sz w:val="22"/>
-          <w:szCs w:val="22"/>
-          <w:lang w:val="en-GB"/>
-        </w:rPr>
-        <w:t>created</w:t>
-      </w:r>
-      <w:r>
-        <w:rPr>
-          <w:rFonts w:ascii="Times New Roman" w:hAnsi="Times New Roman" w:eastAsia="Times New Roman" w:cs="Times New Roman"/>
-          <w:noProof w:val="0"/>
-          <w:sz w:val="22"/>
-          <w:szCs w:val="22"/>
-          <w:lang w:val="en-GB"/>
-        </w:rPr>
-        <w:t xml:space="preserve"> without the </w:t>
-      </w:r>
-      <w:r>
-        <w:rPr>
-          <w:rFonts w:ascii="Times New Roman" w:hAnsi="Times New Roman" w:eastAsia="Times New Roman" w:cs="Times New Roman"/>
-          <w:noProof w:val="0"/>
-          <w:sz w:val="22"/>
-          <w:szCs w:val="22"/>
-          <w:lang w:val="en-GB"/>
-        </w:rPr>
-        <w:t>high costs</w:t>
-      </w:r>
-      <w:r>
-        <w:rPr>
-          <w:rFonts w:ascii="Times New Roman" w:hAnsi="Times New Roman" w:eastAsia="Times New Roman" w:cs="Times New Roman"/>
-          <w:noProof w:val="0"/>
-          <w:sz w:val="22"/>
-          <w:szCs w:val="22"/>
-          <w:lang w:val="en-GB"/>
-        </w:rPr>
-        <w:t xml:space="preserve"> associated with commercial systems</w:t>
-      </w:r>
-      <w:r>
-        <w:rPr>
-          <w:rFonts w:ascii="Aptos" w:hAnsi="Aptos" w:eastAsia="Aptos" w:cs="Aptos"/>
-          <w:noProof w:val="0"/>
-          <w:sz w:val="24"/>
-          <w:szCs w:val="24"/>
-          <w:lang w:val="en-GB"/>
-        </w:rPr>
-        <w:t>.</w:t>
+      </w:pPr>
+      <w:r>
+        <w:rPr>
+          <w:rFonts w:ascii="Aptos" w:hAnsi="Aptos" w:eastAsia="Aptos" w:cs="Aptos"/>
+          <w:noProof w:val="0"/>
+          <w:sz w:val="24"/>
+          <w:szCs w:val="24"/>
+          <w:lang w:val="en-GB"/>
+        </w:rPr>
+        <w:t>The aim of this project is to design and build a low-cost, multi-interface smart home automation system using a Raspberry Pi 4 running Home Assistant as the central control hub. The system integrates an ESP32 microcontroller for environmental sensing and device actuation, communicating over MQTT, alongside an ESP32-S3 paired with a Grove Vision AI V2 module to provide on-device artificial intelligence vision detection. A Waveshare touchscreen interface offers local control in addition to remote access through a web dashboard, while a relay module enables automated switching of connected electrical devices. Together, these components demonstrate that a fully functional, AI-enhanced smart home system can be built affordably, without dependence on costly commercial alternatives.</w:t>
       </w:r>
     </w:p>
     <w:p>
@@ -2047,43 +1842,16 @@
       <w:pPr>
         <w:spacing w:before="240" w:beforeAutospacing="off" w:after="240" w:afterAutospacing="off"/>
         <w:jc w:val="left"/>
-        <w:rPr>
-          <w:rFonts w:ascii="Times New Roman" w:hAnsi="Times New Roman" w:eastAsia="Times New Roman" w:cs="Times New Roman"/>
-          <w:noProof w:val="0"/>
-          <w:sz w:val="22"/>
-          <w:szCs w:val="22"/>
-          <w:lang w:val="en-GB"/>
-        </w:rPr>
-      </w:pPr>
-      <w:r>
-        <w:rPr>
-          <w:rFonts w:ascii="Times New Roman" w:hAnsi="Times New Roman" w:eastAsia="Times New Roman" w:cs="Times New Roman"/>
-          <w:noProof w:val="0"/>
-          <w:sz w:val="22"/>
-          <w:szCs w:val="22"/>
-          <w:lang w:val="en-GB"/>
-        </w:rPr>
-        <w:t xml:space="preserve">The following </w:t>
-      </w:r>
-      <w:r>
-        <w:rPr>
-          <w:rFonts w:ascii="Times New Roman" w:hAnsi="Times New Roman" w:eastAsia="Times New Roman" w:cs="Times New Roman"/>
-          <w:noProof w:val="0"/>
-          <w:sz w:val="22"/>
-          <w:szCs w:val="22"/>
-          <w:lang w:val="en-GB"/>
-        </w:rPr>
-        <w:t>objectives</w:t>
-      </w:r>
-      <w:r>
-        <w:rPr>
-          <w:rFonts w:ascii="Times New Roman" w:hAnsi="Times New Roman" w:eastAsia="Times New Roman" w:cs="Times New Roman"/>
-          <w:noProof w:val="0"/>
-          <w:sz w:val="22"/>
-          <w:szCs w:val="22"/>
-          <w:lang w:val="en-GB"/>
-        </w:rPr>
-        <w:t xml:space="preserve"> were set to guide the development of this project:</w:t>
+      </w:pPr>
+      <w:r>
+        <w:rPr>
+          <w:rFonts w:ascii="Aptos" w:hAnsi="Aptos" w:eastAsia="Aptos" w:cs="Aptos"/>
+          <w:noProof w:val="0"/>
+          <w:sz w:val="24"/>
+          <w:szCs w:val="24"/>
+          <w:lang w:val="en-GB"/>
+        </w:rPr>
+        <w:t>The following objectives were set to guide the development of this project:</w:t>
       </w:r>
     </w:p>
     <w:p>
@@ -2091,57 +1859,27 @@
         <w:pStyle w:val="ListParagraph"/>
         <w:numPr>
           <w:ilvl w:val="0"/>
-          <w:numId w:val="6"/>
+          <w:numId w:val="11"/>
         </w:numPr>
-        <w:spacing w:before="240" w:beforeAutospacing="off" w:after="240" w:afterAutospacing="off"/>
+        <w:spacing w:before="0" w:beforeAutospacing="off" w:after="0" w:afterAutospacing="off"/>
         <w:jc w:val="left"/>
         <w:rPr>
-          <w:rFonts w:ascii="Times New Roman" w:hAnsi="Times New Roman" w:eastAsia="Times New Roman" w:cs="Times New Roman"/>
-          <w:noProof w:val="0"/>
-          <w:sz w:val="22"/>
-          <w:szCs w:val="22"/>
-          <w:lang w:val="en-GB"/>
-        </w:rPr>
-      </w:pPr>
-      <w:r>
-        <w:rPr>
-          <w:rFonts w:ascii="Times New Roman" w:hAnsi="Times New Roman" w:eastAsia="Times New Roman" w:cs="Times New Roman"/>
-          <w:noProof w:val="0"/>
-          <w:sz w:val="22"/>
-          <w:szCs w:val="22"/>
-          <w:lang w:val="en-GB"/>
-        </w:rPr>
-        <w:t xml:space="preserve">To install and set up Home Assistant </w:t>
-      </w:r>
-      <w:r>
-        <w:rPr>
-          <w:rFonts w:ascii="Times New Roman" w:hAnsi="Times New Roman" w:eastAsia="Times New Roman" w:cs="Times New Roman"/>
-          <w:noProof w:val="0"/>
-          <w:sz w:val="22"/>
-          <w:szCs w:val="22"/>
-          <w:lang w:val="en-GB"/>
-        </w:rPr>
-        <w:t>OS (</w:t>
-      </w:r>
-      <w:r>
-        <w:rPr>
-          <w:rFonts w:ascii="Times New Roman" w:hAnsi="Times New Roman" w:eastAsia="Times New Roman" w:cs="Times New Roman"/>
-          <w:noProof w:val="0"/>
-          <w:sz w:val="22"/>
-          <w:szCs w:val="22"/>
-          <w:lang w:val="en-GB"/>
-        </w:rPr>
-        <w:t xml:space="preserve">operating system) </w:t>
-      </w:r>
-      <w:r>
-        <w:rPr>
-          <w:rFonts w:ascii="Times New Roman" w:hAnsi="Times New Roman" w:eastAsia="Times New Roman" w:cs="Times New Roman"/>
-          <w:noProof w:val="0"/>
-          <w:sz w:val="22"/>
-          <w:szCs w:val="22"/>
-          <w:lang w:val="en-GB"/>
-        </w:rPr>
-        <w:t>on a Raspberry Pi 4 as the main platform for the smart home system.</w:t>
+          <w:rFonts w:ascii="Aptos" w:hAnsi="Aptos" w:eastAsia="Aptos" w:cs="Aptos"/>
+          <w:noProof w:val="0"/>
+          <w:sz w:val="24"/>
+          <w:szCs w:val="24"/>
+          <w:lang w:val="en-GB"/>
+        </w:rPr>
+      </w:pPr>
+      <w:r>
+        <w:rPr>
+          <w:rFonts w:ascii="Aptos" w:hAnsi="Aptos" w:eastAsia="Aptos" w:cs="Aptos"/>
+          <w:noProof w:val="0"/>
+          <w:sz w:val="24"/>
+          <w:szCs w:val="24"/>
+          <w:lang w:val="en-GB"/>
+        </w:rPr>
+        <w:t>To install and configure Home Assistant OS on a Raspberry Pi 4 as the central platform for the smart home system.</w:t>
       </w:r>
     </w:p>
     <w:p>
@@ -2149,37 +1887,27 @@
         <w:pStyle w:val="ListParagraph"/>
         <w:numPr>
           <w:ilvl w:val="0"/>
-          <w:numId w:val="6"/>
+          <w:numId w:val="11"/>
         </w:numPr>
-        <w:spacing w:before="240" w:beforeAutospacing="off" w:after="240" w:afterAutospacing="off"/>
+        <w:spacing w:before="0" w:beforeAutospacing="off" w:after="0" w:afterAutospacing="off"/>
         <w:jc w:val="left"/>
         <w:rPr>
-          <w:rFonts w:ascii="Times New Roman" w:hAnsi="Times New Roman" w:eastAsia="Times New Roman" w:cs="Times New Roman"/>
-          <w:noProof w:val="0"/>
-          <w:sz w:val="22"/>
-          <w:szCs w:val="22"/>
-          <w:lang w:val="en-GB"/>
-        </w:rPr>
-      </w:pPr>
-      <w:r>
-        <w:rPr>
-          <w:rFonts w:ascii="Times New Roman" w:hAnsi="Times New Roman" w:eastAsia="Times New Roman" w:cs="Times New Roman"/>
-          <w:noProof w:val="0"/>
-          <w:sz w:val="22"/>
-          <w:szCs w:val="22"/>
-          <w:lang w:val="en-GB"/>
-        </w:rPr>
-        <w:t>To implement a DHT22 sensor for real-time monitoring of indoor temperature and humidity</w:t>
-      </w:r>
-      <w:r>
-        <w:rPr>
-          <w:rFonts w:ascii="Times New Roman" w:hAnsi="Times New Roman" w:eastAsia="Times New Roman" w:cs="Times New Roman"/>
-          <w:noProof w:val="0"/>
-          <w:sz w:val="22"/>
-          <w:szCs w:val="22"/>
-          <w:lang w:val="en-GB"/>
-        </w:rPr>
-        <w:t>.</w:t>
+          <w:rFonts w:ascii="Aptos" w:hAnsi="Aptos" w:eastAsia="Aptos" w:cs="Aptos"/>
+          <w:noProof w:val="0"/>
+          <w:sz w:val="24"/>
+          <w:szCs w:val="24"/>
+          <w:lang w:val="en-GB"/>
+        </w:rPr>
+      </w:pPr>
+      <w:r>
+        <w:rPr>
+          <w:rFonts w:ascii="Aptos" w:hAnsi="Aptos" w:eastAsia="Aptos" w:cs="Aptos"/>
+          <w:noProof w:val="0"/>
+          <w:sz w:val="24"/>
+          <w:szCs w:val="24"/>
+          <w:lang w:val="en-GB"/>
+        </w:rPr>
+        <w:t>To integrate an ESP32 microcontroller for real-time temperature monitoring, publishing sensor data to Home Assistant via MQTT.</w:t>
       </w:r>
     </w:p>
     <w:p>
@@ -2187,57 +1915,27 @@
         <w:pStyle w:val="ListParagraph"/>
         <w:numPr>
           <w:ilvl w:val="0"/>
-          <w:numId w:val="6"/>
+          <w:numId w:val="11"/>
         </w:numPr>
-        <w:spacing w:before="240" w:beforeAutospacing="off" w:after="240" w:afterAutospacing="off"/>
+        <w:spacing w:before="0" w:beforeAutospacing="off" w:after="0" w:afterAutospacing="off"/>
         <w:jc w:val="left"/>
         <w:rPr>
-          <w:rFonts w:ascii="Times New Roman" w:hAnsi="Times New Roman" w:eastAsia="Times New Roman" w:cs="Times New Roman"/>
-          <w:noProof w:val="0"/>
-          <w:sz w:val="22"/>
-          <w:szCs w:val="22"/>
-          <w:lang w:val="en-GB"/>
-        </w:rPr>
-      </w:pPr>
-      <w:r>
-        <w:rPr>
-          <w:rFonts w:ascii="Times New Roman" w:hAnsi="Times New Roman" w:eastAsia="Times New Roman" w:cs="Times New Roman"/>
-          <w:noProof w:val="0"/>
-          <w:sz w:val="22"/>
-          <w:szCs w:val="22"/>
-          <w:lang w:val="en-GB"/>
-        </w:rPr>
-        <w:t xml:space="preserve">To </w:t>
-      </w:r>
-      <w:r>
-        <w:rPr>
-          <w:rFonts w:ascii="Times New Roman" w:hAnsi="Times New Roman" w:eastAsia="Times New Roman" w:cs="Times New Roman"/>
-          <w:noProof w:val="0"/>
-          <w:sz w:val="22"/>
-          <w:szCs w:val="22"/>
-          <w:lang w:val="en-GB"/>
-        </w:rPr>
-        <w:t xml:space="preserve">connect and configure a PIR sensor to </w:t>
-      </w:r>
-      <w:r>
-        <w:rPr>
-          <w:rFonts w:ascii="Times New Roman" w:hAnsi="Times New Roman" w:eastAsia="Times New Roman" w:cs="Times New Roman"/>
-          <w:noProof w:val="0"/>
-          <w:sz w:val="22"/>
-          <w:szCs w:val="22"/>
-          <w:lang w:val="en-GB"/>
-        </w:rPr>
-        <w:t xml:space="preserve">trigger automated responses </w:t>
-      </w:r>
-      <w:r>
-        <w:rPr>
-          <w:rFonts w:ascii="Times New Roman" w:hAnsi="Times New Roman" w:eastAsia="Times New Roman" w:cs="Times New Roman"/>
-          <w:noProof w:val="0"/>
-          <w:sz w:val="22"/>
-          <w:szCs w:val="22"/>
-          <w:lang w:val="en-GB"/>
-        </w:rPr>
-        <w:t>when motion is detected.</w:t>
+          <w:rFonts w:ascii="Aptos" w:hAnsi="Aptos" w:eastAsia="Aptos" w:cs="Aptos"/>
+          <w:noProof w:val="0"/>
+          <w:sz w:val="24"/>
+          <w:szCs w:val="24"/>
+          <w:lang w:val="en-GB"/>
+        </w:rPr>
+      </w:pPr>
+      <w:r>
+        <w:rPr>
+          <w:rFonts w:ascii="Aptos" w:hAnsi="Aptos" w:eastAsia="Aptos" w:cs="Aptos"/>
+          <w:noProof w:val="0"/>
+          <w:sz w:val="24"/>
+          <w:szCs w:val="24"/>
+          <w:lang w:val="en-GB"/>
+        </w:rPr>
+        <w:t>To connect and configure a PIR motion sensor to trigger automated responses based on occupancy detection.</w:t>
       </w:r>
     </w:p>
     <w:p>
@@ -2245,27 +1943,27 @@
         <w:pStyle w:val="ListParagraph"/>
         <w:numPr>
           <w:ilvl w:val="0"/>
-          <w:numId w:val="6"/>
+          <w:numId w:val="11"/>
         </w:numPr>
-        <w:spacing w:before="240" w:beforeAutospacing="off" w:after="240" w:afterAutospacing="off"/>
+        <w:spacing w:before="0" w:beforeAutospacing="off" w:after="0" w:afterAutospacing="off"/>
         <w:jc w:val="left"/>
         <w:rPr>
-          <w:rFonts w:ascii="Times New Roman" w:hAnsi="Times New Roman" w:eastAsia="Times New Roman" w:cs="Times New Roman"/>
-          <w:noProof w:val="0"/>
-          <w:sz w:val="22"/>
-          <w:szCs w:val="22"/>
-          <w:lang w:val="en-GB"/>
-        </w:rPr>
-      </w:pPr>
-      <w:r>
-        <w:rPr>
-          <w:rFonts w:ascii="Times New Roman" w:hAnsi="Times New Roman" w:eastAsia="Times New Roman" w:cs="Times New Roman"/>
-          <w:noProof w:val="0"/>
-          <w:sz w:val="22"/>
-          <w:szCs w:val="22"/>
-          <w:lang w:val="en-GB"/>
-        </w:rPr>
-        <w:t>To wire and control a relay module for switching electrical devices on and off through the Home Assistant dashboard.</w:t>
+          <w:rFonts w:ascii="Aptos" w:hAnsi="Aptos" w:eastAsia="Aptos" w:cs="Aptos"/>
+          <w:noProof w:val="0"/>
+          <w:sz w:val="24"/>
+          <w:szCs w:val="24"/>
+          <w:lang w:val="en-GB"/>
+        </w:rPr>
+      </w:pPr>
+      <w:r>
+        <w:rPr>
+          <w:rFonts w:ascii="Aptos" w:hAnsi="Aptos" w:eastAsia="Aptos" w:cs="Aptos"/>
+          <w:noProof w:val="0"/>
+          <w:sz w:val="24"/>
+          <w:szCs w:val="24"/>
+          <w:lang w:val="en-GB"/>
+        </w:rPr>
+        <w:t>To wire and control a relay module for switching electrical devices through the Home Assistant dashboard.</w:t>
       </w:r>
     </w:p>
     <w:p>
@@ -2273,27 +1971,27 @@
         <w:pStyle w:val="ListParagraph"/>
         <w:numPr>
           <w:ilvl w:val="0"/>
-          <w:numId w:val="6"/>
+          <w:numId w:val="11"/>
         </w:numPr>
-        <w:spacing w:before="240" w:beforeAutospacing="off" w:after="240" w:afterAutospacing="off"/>
+        <w:spacing w:before="0" w:beforeAutospacing="off" w:after="0" w:afterAutospacing="off"/>
         <w:jc w:val="left"/>
         <w:rPr>
-          <w:rFonts w:ascii="Times New Roman" w:hAnsi="Times New Roman" w:eastAsia="Times New Roman" w:cs="Times New Roman"/>
-          <w:noProof w:val="0"/>
-          <w:sz w:val="22"/>
-          <w:szCs w:val="22"/>
-          <w:lang w:val="en-GB"/>
-        </w:rPr>
-      </w:pPr>
-      <w:r>
-        <w:rPr>
-          <w:rFonts w:ascii="Times New Roman" w:hAnsi="Times New Roman" w:eastAsia="Times New Roman" w:cs="Times New Roman"/>
-          <w:noProof w:val="0"/>
-          <w:sz w:val="22"/>
-          <w:szCs w:val="22"/>
-          <w:lang w:val="en-GB"/>
-        </w:rPr>
-        <w:t>To implement an SG90 servo motor to act as a door lock, controlled automatically by the system.</w:t>
+          <w:rFonts w:ascii="Aptos" w:hAnsi="Aptos" w:eastAsia="Aptos" w:cs="Aptos"/>
+          <w:noProof w:val="0"/>
+          <w:sz w:val="24"/>
+          <w:szCs w:val="24"/>
+          <w:lang w:val="en-GB"/>
+        </w:rPr>
+      </w:pPr>
+      <w:r>
+        <w:rPr>
+          <w:rFonts w:ascii="Aptos" w:hAnsi="Aptos" w:eastAsia="Aptos" w:cs="Aptos"/>
+          <w:noProof w:val="0"/>
+          <w:sz w:val="24"/>
+          <w:szCs w:val="24"/>
+          <w:lang w:val="en-GB"/>
+        </w:rPr>
+        <w:t>To integrate an ESP32-S3 with a Grove Vision AI V2 module for on-device person/object detection and automation triggering.</w:t>
       </w:r>
     </w:p>
     <w:p>
@@ -2301,27 +1999,27 @@
         <w:pStyle w:val="ListParagraph"/>
         <w:numPr>
           <w:ilvl w:val="0"/>
-          <w:numId w:val="6"/>
+          <w:numId w:val="11"/>
         </w:numPr>
-        <w:spacing w:before="240" w:beforeAutospacing="off" w:after="240" w:afterAutospacing="off"/>
+        <w:spacing w:before="0" w:beforeAutospacing="off" w:after="0" w:afterAutospacing="off"/>
         <w:jc w:val="left"/>
         <w:rPr>
-          <w:rFonts w:ascii="Times New Roman" w:hAnsi="Times New Roman" w:eastAsia="Times New Roman" w:cs="Times New Roman"/>
-          <w:noProof w:val="0"/>
-          <w:sz w:val="22"/>
-          <w:szCs w:val="22"/>
-          <w:lang w:val="en-GB"/>
-        </w:rPr>
-      </w:pPr>
-      <w:r>
-        <w:rPr>
-          <w:rFonts w:ascii="Times New Roman" w:hAnsi="Times New Roman" w:eastAsia="Times New Roman" w:cs="Times New Roman"/>
-          <w:noProof w:val="0"/>
-          <w:sz w:val="22"/>
-          <w:szCs w:val="22"/>
-          <w:lang w:val="en-GB"/>
-        </w:rPr>
-        <w:t>To evaluate the system through functional testing and user feedback.</w:t>
+          <w:rFonts w:ascii="Aptos" w:hAnsi="Aptos" w:eastAsia="Aptos" w:cs="Aptos"/>
+          <w:noProof w:val="0"/>
+          <w:sz w:val="24"/>
+          <w:szCs w:val="24"/>
+          <w:lang w:val="en-GB"/>
+        </w:rPr>
+      </w:pPr>
+      <w:r>
+        <w:rPr>
+          <w:rFonts w:ascii="Aptos" w:hAnsi="Aptos" w:eastAsia="Aptos" w:cs="Aptos"/>
+          <w:noProof w:val="0"/>
+          <w:sz w:val="24"/>
+          <w:szCs w:val="24"/>
+          <w:lang w:val="en-GB"/>
+        </w:rPr>
+        <w:t>To configure a Waveshare touchscreen for local dashboard interaction and evaluate the complete system through functional testing and user feedback.</w:t>
       </w:r>
     </w:p>
     <w:p>
@@ -2368,6 +2066,36 @@
     </w:p>
     <w:p>
       <w:pPr>
+        <w:jc w:val="left"/>
+      </w:pPr>
+      <w:r>
+        <w:rPr>
+          <w:rFonts w:ascii="Times New Roman" w:hAnsi="Times New Roman" w:eastAsia="Times New Roman" w:cs="Times New Roman"/>
+          <w:noProof w:val="0"/>
+          <w:sz w:val="22"/>
+          <w:szCs w:val="22"/>
+          <w:lang w:val="en-GB"/>
+        </w:rPr>
+        <w:t>The focus of this project is to build a functional, multi-interface smart home prototype for academic purposes. The system includes temperature monitoring, motion-based occupancy detection, automated device switching, AI-based vision detection, and both local touchscreen and remote dashboard access. The project does not aim to replace commercial smart home systems but to demonstrate that a comparably capable, AI-enhanced alternative can be built at low cost using accessible hardware.</w:t>
+      </w:r>
+    </w:p>
+    <w:p>
+      <w:pPr>
+        <w:jc w:val="left"/>
+      </w:pPr>
+      <w:r>
+        <w:rPr>
+          <w:rFonts w:ascii="Times New Roman" w:hAnsi="Times New Roman" w:eastAsia="Times New Roman" w:cs="Times New Roman"/>
+          <w:noProof w:val="0"/>
+          <w:sz w:val="22"/>
+          <w:szCs w:val="22"/>
+          <w:lang w:val="en-GB"/>
+        </w:rPr>
+        <w:t>This project has several limitations. The system depends entirely on a stable Wi-Fi connection; if the network is unavailable, both remote dashboard access and MQTT-based sensor communication are lost. The system operates at prototype level and has not been tested for long-term reliability or deployment in a real home environment. The Grove Vision AI V2 module's detection accuracy is dependent on lighting conditions and camera placement, which were not exhaustively tested across all environments. Security features such as user authentication hardening and encrypted MQTT communication are outside the scope of this project and are recommended for future development.</w:t>
+      </w:r>
+    </w:p>
+    <w:p>
+      <w:pPr>
         <w:pStyle w:val="Normal"/>
         <w:spacing w:before="240" w:beforeAutospacing="off" w:after="240" w:afterAutospacing="off"/>
         <w:jc w:val="left"/>
@@ -2379,86 +2107,6 @@
           <w:lang w:val="en-GB"/>
         </w:rPr>
       </w:pPr>
-      <w:r>
-        <w:rPr>
-          <w:rFonts w:ascii="Times New Roman" w:hAnsi="Times New Roman" w:eastAsia="Times New Roman" w:cs="Times New Roman"/>
-          <w:noProof w:val="0"/>
-          <w:sz w:val="22"/>
-          <w:szCs w:val="22"/>
-          <w:lang w:val="en-GB"/>
-        </w:rPr>
-        <w:t>The focus of this project is to build a functional smart home system as a prototype for academic purposes.</w:t>
-      </w:r>
-      <w:r>
-        <w:rPr>
-          <w:rFonts w:ascii="Times New Roman" w:hAnsi="Times New Roman" w:eastAsia="Times New Roman" w:cs="Times New Roman"/>
-          <w:noProof w:val="0"/>
-          <w:sz w:val="22"/>
-          <w:szCs w:val="22"/>
-          <w:lang w:val="en-GB"/>
-        </w:rPr>
-        <w:t xml:space="preserve"> This setup includes temperature and humidity monitoring, motion sensing, device control, and a simulated door lock</w:t>
-      </w:r>
-      <w:r>
-        <w:rPr>
-          <w:rFonts w:ascii="Times New Roman" w:hAnsi="Times New Roman" w:eastAsia="Times New Roman" w:cs="Times New Roman"/>
-          <w:noProof w:val="0"/>
-          <w:sz w:val="22"/>
-          <w:szCs w:val="22"/>
-          <w:lang w:val="en-GB"/>
-        </w:rPr>
-        <w:t>, all</w:t>
-      </w:r>
-      <w:r>
-        <w:rPr>
-          <w:rFonts w:ascii="Times New Roman" w:hAnsi="Times New Roman" w:eastAsia="Times New Roman" w:cs="Times New Roman"/>
-          <w:noProof w:val="0"/>
-          <w:sz w:val="22"/>
-          <w:szCs w:val="22"/>
-          <w:lang w:val="en-GB"/>
-        </w:rPr>
-        <w:t xml:space="preserve"> accessible through a single dashboard.</w:t>
-      </w:r>
-      <w:r>
-        <w:rPr>
-          <w:rFonts w:ascii="Times New Roman" w:hAnsi="Times New Roman" w:eastAsia="Times New Roman" w:cs="Times New Roman"/>
-          <w:noProof w:val="0"/>
-          <w:sz w:val="22"/>
-          <w:szCs w:val="22"/>
-          <w:lang w:val="en-GB"/>
-        </w:rPr>
-        <w:t xml:space="preserve"> The project does not aim to replace commercial smart home systems but rather to </w:t>
-      </w:r>
-      <w:r>
-        <w:rPr>
-          <w:rFonts w:ascii="Times New Roman" w:hAnsi="Times New Roman" w:eastAsia="Times New Roman" w:cs="Times New Roman"/>
-          <w:noProof w:val="0"/>
-          <w:sz w:val="22"/>
-          <w:szCs w:val="22"/>
-          <w:lang w:val="en-GB"/>
-        </w:rPr>
-        <w:t>show</w:t>
-      </w:r>
-      <w:r>
-        <w:rPr>
-          <w:rFonts w:ascii="Times New Roman" w:hAnsi="Times New Roman" w:eastAsia="Times New Roman" w:cs="Times New Roman"/>
-          <w:noProof w:val="0"/>
-          <w:sz w:val="22"/>
-          <w:szCs w:val="22"/>
-          <w:lang w:val="en-GB"/>
-        </w:rPr>
-        <w:t xml:space="preserve"> </w:t>
-      </w:r>
-      <w:r>
-        <w:rPr>
-          <w:rFonts w:ascii="Times New Roman" w:hAnsi="Times New Roman" w:eastAsia="Times New Roman" w:cs="Times New Roman"/>
-          <w:noProof w:val="0"/>
-          <w:sz w:val="22"/>
-          <w:szCs w:val="22"/>
-          <w:lang w:val="en-GB"/>
-        </w:rPr>
-        <w:t>that a functional alternative can be built at low cost.</w:t>
-      </w:r>
     </w:p>
     <w:p>
       <w:pPr>
@@ -2466,122 +2114,39 @@
         <w:spacing w:before="240" w:beforeAutospacing="off" w:after="240" w:afterAutospacing="off"/>
         <w:jc w:val="left"/>
         <w:rPr>
-          <w:rFonts w:ascii="Times New Roman" w:hAnsi="Times New Roman" w:eastAsia="Times New Roman" w:cs="Times New Roman"/>
-          <w:noProof w:val="0"/>
-          <w:sz w:val="22"/>
-          <w:szCs w:val="22"/>
-          <w:lang w:val="en-GB"/>
-        </w:rPr>
-      </w:pPr>
-      <w:r>
-        <w:rPr>
-          <w:rFonts w:ascii="Times New Roman" w:hAnsi="Times New Roman" w:eastAsia="Times New Roman" w:cs="Times New Roman"/>
-          <w:noProof w:val="0"/>
-          <w:sz w:val="22"/>
-          <w:szCs w:val="22"/>
-          <w:lang w:val="en-GB"/>
-        </w:rPr>
-        <w:t xml:space="preserve">This project has some limitations. The system depends entirely on a stable </w:t>
-      </w:r>
-      <w:r>
-        <w:rPr>
-          <w:rFonts w:ascii="Times New Roman" w:hAnsi="Times New Roman" w:eastAsia="Times New Roman" w:cs="Times New Roman"/>
-          <w:noProof w:val="0"/>
-          <w:sz w:val="22"/>
-          <w:szCs w:val="22"/>
-          <w:lang w:val="en-GB"/>
-        </w:rPr>
-        <w:t>Wi-Fi</w:t>
-      </w:r>
-      <w:r>
-        <w:rPr>
-          <w:rFonts w:ascii="Times New Roman" w:hAnsi="Times New Roman" w:eastAsia="Times New Roman" w:cs="Times New Roman"/>
-          <w:noProof w:val="0"/>
-          <w:sz w:val="22"/>
-          <w:szCs w:val="22"/>
-          <w:lang w:val="en-GB"/>
-        </w:rPr>
-        <w:t xml:space="preserve"> connection — if the network is unavailable, remote access to the dashboard is lost.</w:t>
-      </w:r>
-      <w:r>
-        <w:rPr>
-          <w:rFonts w:ascii="Times New Roman" w:hAnsi="Times New Roman" w:eastAsia="Times New Roman" w:cs="Times New Roman"/>
-          <w:noProof w:val="0"/>
-          <w:sz w:val="22"/>
-          <w:szCs w:val="22"/>
-          <w:lang w:val="en-GB"/>
-        </w:rPr>
-        <w:t xml:space="preserve"> The system </w:t>
-      </w:r>
-      <w:r>
-        <w:rPr>
-          <w:rFonts w:ascii="Times New Roman" w:hAnsi="Times New Roman" w:eastAsia="Times New Roman" w:cs="Times New Roman"/>
-          <w:noProof w:val="0"/>
-          <w:sz w:val="22"/>
-          <w:szCs w:val="22"/>
-          <w:lang w:val="en-GB"/>
-        </w:rPr>
-        <w:t>operates</w:t>
-      </w:r>
-      <w:r>
-        <w:rPr>
-          <w:rFonts w:ascii="Times New Roman" w:hAnsi="Times New Roman" w:eastAsia="Times New Roman" w:cs="Times New Roman"/>
-          <w:noProof w:val="0"/>
-          <w:sz w:val="22"/>
-          <w:szCs w:val="22"/>
-          <w:lang w:val="en-GB"/>
-        </w:rPr>
-        <w:t xml:space="preserve"> at prototype level and has not been tested for long-term reliability or </w:t>
-      </w:r>
-      <w:r>
-        <w:rPr>
-          <w:rFonts w:ascii="Times New Roman" w:hAnsi="Times New Roman" w:eastAsia="Times New Roman" w:cs="Times New Roman"/>
-          <w:noProof w:val="0"/>
-          <w:sz w:val="22"/>
-          <w:szCs w:val="22"/>
-          <w:lang w:val="en-GB"/>
-        </w:rPr>
-        <w:t>use</w:t>
-      </w:r>
-      <w:r>
-        <w:rPr>
-          <w:rFonts w:ascii="Times New Roman" w:hAnsi="Times New Roman" w:eastAsia="Times New Roman" w:cs="Times New Roman"/>
-          <w:noProof w:val="0"/>
-          <w:sz w:val="22"/>
-          <w:szCs w:val="22"/>
-          <w:lang w:val="en-GB"/>
-        </w:rPr>
-        <w:t xml:space="preserve"> in a real home environment.</w:t>
-      </w:r>
-      <w:r>
-        <w:rPr>
-          <w:rFonts w:ascii="Times New Roman" w:hAnsi="Times New Roman" w:eastAsia="Times New Roman" w:cs="Times New Roman"/>
-          <w:noProof w:val="0"/>
-          <w:sz w:val="22"/>
-          <w:szCs w:val="22"/>
-          <w:lang w:val="en-GB"/>
-        </w:rPr>
-        <w:t xml:space="preserve"> Security features such as user authentication and encrypted communication are outside the scope of this project and are recommended for future development.</w:t>
-      </w:r>
-      <w:r>
-        <w:rPr>
-          <w:rFonts w:ascii="Times New Roman" w:hAnsi="Times New Roman" w:eastAsia="Times New Roman" w:cs="Times New Roman"/>
-          <w:noProof w:val="0"/>
-          <w:sz w:val="22"/>
-          <w:szCs w:val="22"/>
-          <w:lang w:val="en-GB"/>
-        </w:rPr>
-        <w:t xml:space="preserve"> Hardware development is limited to scheduled sessions at school, which restricts the total time available for physical testing and integration</w:t>
-      </w:r>
-      <w:r>
-        <w:rPr>
-          <w:rFonts w:ascii="Times New Roman" w:hAnsi="Times New Roman" w:eastAsia="Times New Roman" w:cs="Times New Roman"/>
-          <w:noProof w:val="0"/>
-          <w:sz w:val="22"/>
-          <w:szCs w:val="22"/>
-          <w:lang w:val="en-GB"/>
-        </w:rPr>
-        <w:t>.</w:t>
+          <w:rFonts w:ascii="Aptos" w:hAnsi="Aptos" w:eastAsia="Aptos" w:cs="Aptos"/>
+          <w:noProof w:val="0"/>
+          <w:sz w:val="24"/>
+          <w:szCs w:val="24"/>
+          <w:lang w:val="en-GB"/>
+        </w:rPr>
+      </w:pPr>
+    </w:p>
+    <w:p>
+      <w:pPr>
+        <w:spacing w:before="240" w:beforeAutospacing="off" w:after="240" w:afterAutospacing="off"/>
+        <w:jc w:val="left"/>
+        <w:rPr>
+          <w:rFonts w:ascii="Times New Roman" w:hAnsi="Times New Roman" w:eastAsia="Times New Roman" w:cs="Times New Roman"/>
+          <w:b w:val="1"/>
+          <w:bCs w:val="1"/>
+          <w:noProof w:val="0"/>
+          <w:sz w:val="24"/>
+          <w:szCs w:val="24"/>
+          <w:lang w:val="en-GB"/>
+        </w:rPr>
+      </w:pPr>
+      <w:r>
+        <w:rPr>
+          <w:rFonts w:ascii="Times New Roman" w:hAnsi="Times New Roman" w:eastAsia="Times New Roman" w:cs="Times New Roman"/>
+          <w:b w:val="1"/>
+          <w:bCs w:val="1"/>
+          <w:noProof w:val="0"/>
+          <w:sz w:val="24"/>
+          <w:szCs w:val="24"/>
+          <w:lang w:val="en-GB"/>
+        </w:rPr>
+        <w:t>1.6 Structure of Thesis</w:t>
       </w:r>
     </w:p>
     <w:p>
@@ -2589,274 +2154,16 @@
         <w:pStyle w:val="Normal"/>
         <w:spacing w:before="240" w:beforeAutospacing="off" w:after="240" w:afterAutospacing="off"/>
         <w:jc w:val="left"/>
-        <w:rPr>
-          <w:rFonts w:ascii="Aptos" w:hAnsi="Aptos" w:eastAsia="Aptos" w:cs="Aptos"/>
-          <w:noProof w:val="0"/>
-          <w:sz w:val="24"/>
-          <w:szCs w:val="24"/>
-          <w:lang w:val="en-GB"/>
-        </w:rPr>
-      </w:pPr>
-    </w:p>
-    <w:p>
-      <w:pPr>
-        <w:spacing w:before="240" w:beforeAutospacing="off" w:after="240" w:afterAutospacing="off"/>
-        <w:jc w:val="left"/>
-        <w:rPr>
-          <w:rFonts w:ascii="Times New Roman" w:hAnsi="Times New Roman" w:eastAsia="Times New Roman" w:cs="Times New Roman"/>
-          <w:b w:val="1"/>
-          <w:bCs w:val="1"/>
-          <w:noProof w:val="0"/>
-          <w:sz w:val="24"/>
-          <w:szCs w:val="24"/>
-          <w:lang w:val="en-GB"/>
-        </w:rPr>
-      </w:pPr>
-      <w:r>
-        <w:rPr>
-          <w:rFonts w:ascii="Times New Roman" w:hAnsi="Times New Roman" w:eastAsia="Times New Roman" w:cs="Times New Roman"/>
-          <w:b w:val="1"/>
-          <w:bCs w:val="1"/>
-          <w:noProof w:val="0"/>
-          <w:sz w:val="24"/>
-          <w:szCs w:val="24"/>
-          <w:lang w:val="en-GB"/>
-        </w:rPr>
-        <w:t>1.6 Structure of Thesis</w:t>
-      </w:r>
-    </w:p>
-    <w:p>
-      <w:pPr>
-        <w:pStyle w:val="Normal"/>
-        <w:spacing w:before="240" w:beforeAutospacing="off" w:after="240" w:afterAutospacing="off"/>
-        <w:jc w:val="left"/>
-        <w:rPr>
-          <w:rFonts w:ascii="Times New Roman" w:hAnsi="Times New Roman" w:eastAsia="Times New Roman" w:cs="Times New Roman"/>
-          <w:noProof w:val="0"/>
-          <w:sz w:val="22"/>
-          <w:szCs w:val="22"/>
-          <w:lang w:val="en-GB"/>
-        </w:rPr>
-      </w:pPr>
-      <w:r>
-        <w:rPr>
-          <w:rFonts w:ascii="Times New Roman" w:hAnsi="Times New Roman" w:eastAsia="Times New Roman" w:cs="Times New Roman"/>
-          <w:noProof w:val="0"/>
-          <w:sz w:val="22"/>
-          <w:szCs w:val="22"/>
-          <w:lang w:val="en-GB"/>
-        </w:rPr>
-        <w:t xml:space="preserve">This thesis is organised into six chapters. Chapter 1 introduces the project by providing background context, </w:t>
-      </w:r>
-      <w:r>
-        <w:rPr>
-          <w:rFonts w:ascii="Times New Roman" w:hAnsi="Times New Roman" w:eastAsia="Times New Roman" w:cs="Times New Roman"/>
-          <w:noProof w:val="0"/>
-          <w:sz w:val="22"/>
-          <w:szCs w:val="22"/>
-          <w:lang w:val="en-GB"/>
-        </w:rPr>
-        <w:t>establishing</w:t>
-      </w:r>
-      <w:r>
-        <w:rPr>
-          <w:rFonts w:ascii="Times New Roman" w:hAnsi="Times New Roman" w:eastAsia="Times New Roman" w:cs="Times New Roman"/>
-          <w:noProof w:val="0"/>
-          <w:sz w:val="22"/>
-          <w:szCs w:val="22"/>
-          <w:lang w:val="en-GB"/>
-        </w:rPr>
-        <w:t xml:space="preserve"> the significance of the study, and defining the aim, </w:t>
-      </w:r>
-      <w:r>
-        <w:rPr>
-          <w:rFonts w:ascii="Times New Roman" w:hAnsi="Times New Roman" w:eastAsia="Times New Roman" w:cs="Times New Roman"/>
-          <w:noProof w:val="0"/>
-          <w:sz w:val="22"/>
-          <w:szCs w:val="22"/>
-          <w:lang w:val="en-GB"/>
-        </w:rPr>
-        <w:t>objectives</w:t>
-      </w:r>
-      <w:r>
-        <w:rPr>
-          <w:rFonts w:ascii="Times New Roman" w:hAnsi="Times New Roman" w:eastAsia="Times New Roman" w:cs="Times New Roman"/>
-          <w:noProof w:val="0"/>
-          <w:sz w:val="22"/>
-          <w:szCs w:val="22"/>
-          <w:lang w:val="en-GB"/>
-        </w:rPr>
-        <w:t>, scope, and limitations.</w:t>
-      </w:r>
-      <w:r>
-        <w:rPr>
-          <w:rFonts w:ascii="Times New Roman" w:hAnsi="Times New Roman" w:eastAsia="Times New Roman" w:cs="Times New Roman"/>
-          <w:noProof w:val="0"/>
-          <w:sz w:val="22"/>
-          <w:szCs w:val="22"/>
-          <w:lang w:val="en-GB"/>
-        </w:rPr>
-        <w:t xml:space="preserve"> Chapter 2 presents a review of existing literature covering smart home systems, the Home Assistant platform, Raspberry Pi in IoT applications, </w:t>
-      </w:r>
-      <w:r>
-        <w:rPr>
-          <w:rFonts w:ascii="Times New Roman" w:hAnsi="Times New Roman" w:eastAsia="Times New Roman" w:cs="Times New Roman"/>
-          <w:noProof w:val="0"/>
-          <w:sz w:val="22"/>
-          <w:szCs w:val="22"/>
-          <w:lang w:val="en-GB"/>
-        </w:rPr>
-        <w:t>IIoT</w:t>
-      </w:r>
-      <w:r>
-        <w:rPr>
-          <w:rFonts w:ascii="Times New Roman" w:hAnsi="Times New Roman" w:eastAsia="Times New Roman" w:cs="Times New Roman"/>
-          <w:noProof w:val="0"/>
-          <w:sz w:val="22"/>
-          <w:szCs w:val="22"/>
-          <w:lang w:val="en-GB"/>
-        </w:rPr>
-        <w:t xml:space="preserve"> trends, sensor technologies, and a comparison of existing commercial systems.</w:t>
-      </w:r>
-      <w:r>
-        <w:rPr>
-          <w:rFonts w:ascii="Times New Roman" w:hAnsi="Times New Roman" w:eastAsia="Times New Roman" w:cs="Times New Roman"/>
-          <w:noProof w:val="0"/>
-          <w:sz w:val="22"/>
-          <w:szCs w:val="22"/>
-          <w:lang w:val="en-GB"/>
-        </w:rPr>
-        <w:t xml:space="preserve"> Chapter 3 describes the system design, including the architecture, hardware selection, automation logic, dashboard layout, and wiring diagrams.</w:t>
-      </w:r>
-      <w:r>
-        <w:rPr>
-          <w:rFonts w:ascii="Times New Roman" w:hAnsi="Times New Roman" w:eastAsia="Times New Roman" w:cs="Times New Roman"/>
-          <w:noProof w:val="0"/>
-          <w:sz w:val="22"/>
-          <w:szCs w:val="22"/>
-          <w:lang w:val="en-GB"/>
-        </w:rPr>
-        <w:t xml:space="preserve"> Chapter 4 describes how the system was implemented, including setting up all the hardware parts and creating the automations and dashboard.</w:t>
-      </w:r>
-      <w:r>
-        <w:rPr>
-          <w:rFonts w:ascii="Times New Roman" w:hAnsi="Times New Roman" w:eastAsia="Times New Roman" w:cs="Times New Roman"/>
-          <w:noProof w:val="0"/>
-          <w:sz w:val="22"/>
-          <w:szCs w:val="22"/>
-          <w:lang w:val="en-GB"/>
-        </w:rPr>
-        <w:t xml:space="preserve"> </w:t>
-      </w:r>
-      <w:r>
-        <w:rPr>
-          <w:rFonts w:ascii="Times New Roman" w:hAnsi="Times New Roman" w:eastAsia="Times New Roman" w:cs="Times New Roman"/>
-          <w:noProof w:val="0"/>
-          <w:sz w:val="22"/>
-          <w:szCs w:val="22"/>
-          <w:lang w:val="en-GB"/>
-        </w:rPr>
-        <w:t xml:space="preserve">Chapter 5 explains how the system was tested, </w:t>
-      </w:r>
-      <w:r>
-        <w:rPr>
-          <w:rFonts w:ascii="Times New Roman" w:hAnsi="Times New Roman" w:eastAsia="Times New Roman" w:cs="Times New Roman"/>
-          <w:noProof w:val="0"/>
-          <w:sz w:val="22"/>
-          <w:szCs w:val="22"/>
-          <w:lang w:val="en-GB"/>
-        </w:rPr>
-        <w:t>presents sensor accuracy results</w:t>
-      </w:r>
-      <w:r>
-        <w:rPr>
-          <w:rFonts w:ascii="Times New Roman" w:hAnsi="Times New Roman" w:eastAsia="Times New Roman" w:cs="Times New Roman"/>
-          <w:noProof w:val="0"/>
-          <w:sz w:val="22"/>
-          <w:szCs w:val="22"/>
-          <w:lang w:val="en-GB"/>
-        </w:rPr>
-        <w:t xml:space="preserve">, </w:t>
-      </w:r>
-      <w:r>
-        <w:rPr>
-          <w:rFonts w:ascii="Times New Roman" w:hAnsi="Times New Roman" w:eastAsia="Times New Roman" w:cs="Times New Roman"/>
-          <w:noProof w:val="0"/>
-          <w:sz w:val="22"/>
-          <w:szCs w:val="22"/>
-          <w:lang w:val="en-GB"/>
-        </w:rPr>
-        <w:t>evaluates automation performance</w:t>
-      </w:r>
-      <w:r>
-        <w:rPr>
-          <w:rFonts w:ascii="Times New Roman" w:hAnsi="Times New Roman" w:eastAsia="Times New Roman" w:cs="Times New Roman"/>
-          <w:noProof w:val="0"/>
-          <w:sz w:val="22"/>
-          <w:szCs w:val="22"/>
-          <w:lang w:val="en-GB"/>
-        </w:rPr>
-        <w:t>, and shares feedback from users</w:t>
-      </w:r>
-      <w:r>
-        <w:rPr>
-          <w:rFonts w:ascii="Times New Roman" w:hAnsi="Times New Roman" w:eastAsia="Times New Roman" w:cs="Times New Roman"/>
-          <w:noProof w:val="0"/>
-          <w:sz w:val="22"/>
-          <w:szCs w:val="22"/>
-          <w:lang w:val="en-GB"/>
-        </w:rPr>
-        <w:t>.</w:t>
-      </w:r>
-      <w:r>
-        <w:rPr>
-          <w:rFonts w:ascii="Times New Roman" w:hAnsi="Times New Roman" w:eastAsia="Times New Roman" w:cs="Times New Roman"/>
-          <w:noProof w:val="0"/>
-          <w:sz w:val="22"/>
-          <w:szCs w:val="22"/>
-          <w:lang w:val="en-GB"/>
-        </w:rPr>
-        <w:t xml:space="preserve"> Chapter 6 concludes the thesis by summarizing what was achieved, checking the </w:t>
-      </w:r>
-      <w:r>
-        <w:rPr>
-          <w:rFonts w:ascii="Times New Roman" w:hAnsi="Times New Roman" w:eastAsia="Times New Roman" w:cs="Times New Roman"/>
-          <w:noProof w:val="0"/>
-          <w:sz w:val="22"/>
-          <w:szCs w:val="22"/>
-          <w:lang w:val="en-GB"/>
-        </w:rPr>
-        <w:t>objectives</w:t>
-      </w:r>
-      <w:r>
-        <w:rPr>
-          <w:rFonts w:ascii="Times New Roman" w:hAnsi="Times New Roman" w:eastAsia="Times New Roman" w:cs="Times New Roman"/>
-          <w:noProof w:val="0"/>
-          <w:sz w:val="22"/>
-          <w:szCs w:val="22"/>
-          <w:lang w:val="en-GB"/>
-        </w:rPr>
-        <w:t xml:space="preserve">, noting limitations, suggesting future improvements, and reflecting on how the project relates to </w:t>
-      </w:r>
-      <w:r>
-        <w:rPr>
-          <w:rFonts w:ascii="Times New Roman" w:hAnsi="Times New Roman" w:eastAsia="Times New Roman" w:cs="Times New Roman"/>
-          <w:noProof w:val="0"/>
-          <w:sz w:val="22"/>
-          <w:szCs w:val="22"/>
-          <w:lang w:val="en-GB"/>
-        </w:rPr>
-        <w:t>IIoT</w:t>
-      </w:r>
-      <w:r>
-        <w:rPr>
-          <w:rFonts w:ascii="Times New Roman" w:hAnsi="Times New Roman" w:eastAsia="Times New Roman" w:cs="Times New Roman"/>
-          <w:noProof w:val="0"/>
-          <w:sz w:val="22"/>
-          <w:szCs w:val="22"/>
-          <w:lang w:val="en-GB"/>
-        </w:rPr>
-        <w:t xml:space="preserve"> trends.</w:t>
+      </w:pPr>
+      <w:r>
+        <w:rPr>
+          <w:rFonts w:ascii="Times New Roman" w:hAnsi="Times New Roman" w:eastAsia="Times New Roman" w:cs="Times New Roman"/>
+          <w:noProof w:val="0"/>
+          <w:sz w:val="22"/>
+          <w:szCs w:val="22"/>
+          <w:lang w:val="en-GB"/>
+        </w:rPr>
+        <w:t>This thesis is organised into six chapters. Chapter 1 introduces the project by providing background context, establishing the significance of the study, and defining the aim, objectives, scope, and limitations. Chapter 2 presents a review of existing literature covering smart home systems, the Home Assistant platform, Raspberry Pi in IoT applications, IIoT trends, sensor and AI vision technologies, and a comparison of existing commercial systems. Chapter 3 describes the system design, including the architecture, hardware selection, automation logic, dashboard layout, and wiring diagrams. Chapter 4 describes the implementation of the core hardware system, including sensor integration, MQTT communication, relay control, and dashboard development. Chapter 5 details the implementation of the AI vision component, presents full system integration testing, and shares results from user evaluation. Chapter 6 concludes the thesis by summarising what was achieved, evaluating performance against the objectives, noting limitations, suggesting future improvements, and reflecting on the project's relevance to IIoT trends.</w:t>
       </w:r>
     </w:p>
     <w:p>
@@ -4807,88 +4114,49 @@
           <w:bCs w:val="1"/>
           <w:noProof w:val="0"/>
           <w:color w:val="auto"/>
+          <w:sz w:val="24"/>
+          <w:szCs w:val="24"/>
+          <w:lang w:val="en-GB"/>
+        </w:rPr>
+        <w:t xml:space="preserve">Section 2.4 — </w:t>
+      </w:r>
+      <w:r>
+        <w:rPr>
+          <w:rFonts w:ascii="Times New Roman" w:hAnsi="Times New Roman" w:eastAsia="Times New Roman" w:cs="Times New Roman"/>
+          <w:b w:val="1"/>
+          <w:bCs w:val="1"/>
+          <w:noProof w:val="0"/>
+          <w:color w:val="auto"/>
+          <w:sz w:val="24"/>
+          <w:szCs w:val="24"/>
+          <w:lang w:val="en-GB"/>
+        </w:rPr>
+        <w:t>IIoT</w:t>
+      </w:r>
+      <w:r>
+        <w:rPr>
+          <w:rFonts w:ascii="Times New Roman" w:hAnsi="Times New Roman" w:eastAsia="Times New Roman" w:cs="Times New Roman"/>
+          <w:b w:val="1"/>
+          <w:bCs w:val="1"/>
+          <w:noProof w:val="0"/>
+          <w:color w:val="auto"/>
+          <w:sz w:val="24"/>
+          <w:szCs w:val="24"/>
+          <w:lang w:val="en-GB"/>
+        </w:rPr>
+        <w:t xml:space="preserve"> Trends and Relevance</w:t>
+      </w:r>
+      <w:r>
+        <w:rPr>
+          <w:rFonts w:ascii="Times New Roman" w:hAnsi="Times New Roman" w:eastAsia="Times New Roman" w:cs="Times New Roman"/>
+          <w:b w:val="1"/>
+          <w:bCs w:val="1"/>
+          <w:noProof w:val="0"/>
           <w:sz w:val="28"/>
           <w:szCs w:val="28"/>
           <w:lang w:val="en-GB"/>
         </w:rPr>
-        <w:t xml:space="preserve">Section 2.4 — </w:t>
-      </w:r>
-      <w:r>
-        <w:rPr>
-          <w:rFonts w:ascii="Times New Roman" w:hAnsi="Times New Roman" w:eastAsia="Times New Roman" w:cs="Times New Roman"/>
-          <w:b w:val="1"/>
-          <w:bCs w:val="1"/>
-          <w:noProof w:val="0"/>
-          <w:color w:val="auto"/>
-          <w:sz w:val="28"/>
-          <w:szCs w:val="28"/>
-          <w:lang w:val="en-GB"/>
-        </w:rPr>
-        <w:t>IIoT</w:t>
-      </w:r>
-      <w:r>
-        <w:rPr>
-          <w:rFonts w:ascii="Times New Roman" w:hAnsi="Times New Roman" w:eastAsia="Times New Roman" w:cs="Times New Roman"/>
-          <w:b w:val="1"/>
-          <w:bCs w:val="1"/>
-          <w:noProof w:val="0"/>
-          <w:color w:val="auto"/>
-          <w:sz w:val="28"/>
-          <w:szCs w:val="28"/>
-          <w:lang w:val="en-GB"/>
-        </w:rPr>
-        <w:t xml:space="preserve"> Trends and Relevance</w:t>
-      </w:r>
-      <w:r>
-        <w:rPr>
-          <w:rFonts w:ascii="Times New Roman" w:hAnsi="Times New Roman" w:eastAsia="Times New Roman" w:cs="Times New Roman"/>
-          <w:b w:val="1"/>
-          <w:bCs w:val="1"/>
-          <w:noProof w:val="0"/>
-          <w:sz w:val="28"/>
-          <w:szCs w:val="28"/>
-          <w:lang w:val="en-GB"/>
-        </w:rPr>
         <w:t xml:space="preserve"> </w:t>
-      </w:r>
-    </w:p>
-    <w:p>
-      <w:pPr>
-        <w:spacing w:before="240" w:beforeAutospacing="off" w:after="240" w:afterAutospacing="off"/>
-        <w:jc w:val="left"/>
-        <w:rPr>
-          <w:rFonts w:ascii="Times New Roman" w:hAnsi="Times New Roman" w:eastAsia="Times New Roman" w:cs="Times New Roman"/>
-          <w:b w:val="1"/>
-          <w:bCs w:val="1"/>
-          <w:noProof w:val="0"/>
-          <w:sz w:val="22"/>
-          <w:szCs w:val="22"/>
-          <w:lang w:val="en-GB"/>
-        </w:rPr>
-      </w:pPr>
-      <w:r>
-        <w:rPr>
-          <w:rFonts w:ascii="Times New Roman" w:hAnsi="Times New Roman" w:eastAsia="Times New Roman" w:cs="Times New Roman"/>
-          <w:b w:val="1"/>
-          <w:bCs w:val="1"/>
-          <w:noProof w:val="0"/>
-          <w:sz w:val="22"/>
-          <w:szCs w:val="22"/>
-          <w:lang w:val="en-GB"/>
-        </w:rPr>
-        <w:t>IIoT</w:t>
-      </w:r>
-      <w:r>
-        <w:rPr>
-          <w:rFonts w:ascii="Times New Roman" w:hAnsi="Times New Roman" w:eastAsia="Times New Roman" w:cs="Times New Roman"/>
-          <w:b w:val="1"/>
-          <w:bCs w:val="1"/>
-          <w:noProof w:val="0"/>
-          <w:sz w:val="22"/>
-          <w:szCs w:val="22"/>
-          <w:lang w:val="en-GB"/>
-        </w:rPr>
-        <w:t xml:space="preserve"> market scale and growth</w:t>
       </w:r>
     </w:p>
     <w:p>
@@ -4896,53 +4164,36 @@
         <w:pStyle w:val="Normal"/>
         <w:spacing w:before="240" w:beforeAutospacing="off" w:after="240" w:afterAutospacing="off"/>
         <w:jc w:val="left"/>
-        <w:rPr>
-          <w:rFonts w:ascii="Times New Roman" w:hAnsi="Times New Roman" w:eastAsia="Times New Roman" w:cs="Times New Roman"/>
-          <w:noProof w:val="0"/>
-          <w:sz w:val="22"/>
-          <w:szCs w:val="22"/>
-          <w:lang w:val="en-GB"/>
-        </w:rPr>
-      </w:pPr>
-      <w:r>
-        <w:rPr>
-          <w:rFonts w:ascii="Times New Roman" w:hAnsi="Times New Roman" w:eastAsia="Times New Roman" w:cs="Times New Roman"/>
-          <w:noProof w:val="0"/>
-          <w:sz w:val="22"/>
-          <w:szCs w:val="22"/>
-          <w:lang w:val="en-GB"/>
-        </w:rPr>
-        <w:t xml:space="preserve">The Industrial Internet of Things is one of the fastest-growing technology sectors globally. </w:t>
-      </w:r>
-      <w:r>
-        <w:rPr>
-          <w:rFonts w:ascii="Times New Roman" w:hAnsi="Times New Roman" w:eastAsia="Times New Roman" w:cs="Times New Roman"/>
-          <w:noProof w:val="0"/>
-          <w:sz w:val="22"/>
-          <w:szCs w:val="22"/>
-          <w:lang w:val="en-GB"/>
-        </w:rPr>
-        <w:t>According to IMARC Group, the Industr</w:t>
-      </w:r>
-      <w:r>
-        <w:rPr>
-          <w:rFonts w:ascii="Times New Roman" w:hAnsi="Times New Roman" w:eastAsia="Times New Roman" w:cs="Times New Roman"/>
-          <w:noProof w:val="0"/>
-          <w:sz w:val="22"/>
-          <w:szCs w:val="22"/>
-          <w:lang w:val="en-GB"/>
-        </w:rPr>
-        <w:t xml:space="preserve">ial </w:t>
-      </w:r>
-      <w:r>
-        <w:rPr>
-          <w:rFonts w:ascii="Times New Roman" w:hAnsi="Times New Roman" w:eastAsia="Times New Roman" w:cs="Times New Roman"/>
-          <w:noProof w:val="0"/>
-          <w:sz w:val="22"/>
-          <w:szCs w:val="22"/>
-          <w:lang w:val="en-GB"/>
-        </w:rPr>
-        <w:t>Internet of Things (</w:t>
+      </w:pPr>
+      <w:r>
+        <w:rPr>
+          <w:rFonts w:ascii="Times New Roman" w:hAnsi="Times New Roman" w:eastAsia="Times New Roman" w:cs="Times New Roman"/>
+          <w:noProof w:val="0"/>
+          <w:sz w:val="22"/>
+          <w:szCs w:val="22"/>
+          <w:lang w:val="en-GB"/>
+        </w:rPr>
+        <w:t>The Industrial Internet of Things is one of the fastest-growing technology sectors globally.</w:t>
+      </w:r>
+      <w:r>
+        <w:rPr>
+          <w:rFonts w:ascii="Times New Roman" w:hAnsi="Times New Roman" w:eastAsia="Times New Roman" w:cs="Times New Roman"/>
+          <w:noProof w:val="0"/>
+          <w:sz w:val="22"/>
+          <w:szCs w:val="22"/>
+          <w:lang w:val="en-GB"/>
+        </w:rPr>
+        <w:t xml:space="preserve"> </w:t>
+      </w:r>
+      <w:r>
+        <w:rPr>
+          <w:rFonts w:ascii="Times New Roman" w:hAnsi="Times New Roman" w:eastAsia="Times New Roman" w:cs="Times New Roman"/>
+          <w:noProof w:val="0"/>
+          <w:sz w:val="22"/>
+          <w:szCs w:val="22"/>
+          <w:lang w:val="en-GB"/>
+        </w:rPr>
+        <w:t>According to IMARC Group, the Industrial Internet of Things (</w:t>
       </w:r>
       <w:r>
         <w:rPr>
@@ -4962,37 +4213,27 @@
           <w:szCs w:val="22"/>
           <w:lang w:val="en-GB"/>
         </w:rPr>
-        <w:t>) market reached USD 325.7 billion in 2025 and is expected to increase to USD 944.8 billion by 2034, representing a compound annual growth rate (CAGR) of 12.18%.</w:t>
-      </w:r>
-      <w:r>
-        <w:rPr>
-          <w:rFonts w:ascii="Times New Roman" w:hAnsi="Times New Roman" w:eastAsia="Times New Roman" w:cs="Times New Roman"/>
-          <w:noProof w:val="0"/>
-          <w:sz w:val="22"/>
-          <w:szCs w:val="22"/>
-          <w:lang w:val="en-GB"/>
-        </w:rPr>
-        <w:t xml:space="preserve">CBI reports that Europe’s IoT market is expected to grow from €179 billion in 2025 to €258 billion by 2029, at a CAGR of 9.62%. Globally, there are around 20 billion active IoT devices in 2025, projected to exceed 40 billion by 2034, with Europe accounting for approximately one-fifth of these </w:t>
-      </w:r>
-      <w:r>
-        <w:rPr>
-          <w:rFonts w:ascii="Times New Roman" w:hAnsi="Times New Roman" w:eastAsia="Times New Roman" w:cs="Times New Roman"/>
-          <w:noProof w:val="0"/>
-          <w:sz w:val="22"/>
-          <w:szCs w:val="22"/>
-          <w:lang w:val="en-GB"/>
-        </w:rPr>
-        <w:t>devices. Key</w:t>
-      </w:r>
-      <w:r>
-        <w:rPr>
-          <w:rFonts w:ascii="Times New Roman" w:hAnsi="Times New Roman" w:eastAsia="Times New Roman" w:cs="Times New Roman"/>
-          <w:noProof w:val="0"/>
-          <w:sz w:val="22"/>
-          <w:szCs w:val="22"/>
-          <w:lang w:val="en-GB"/>
-        </w:rPr>
-        <w:t xml:space="preserve"> factors driving this growth are the expansion of 5G connectivity, developments in edge computing, and the rising use of artificial intelligence within IoT systems.</w:t>
+        <w:t xml:space="preserve">) market reached USD 325.7 billion in 2025 and is expected to increase to USD 944.8 billion by 2034, </w:t>
+      </w:r>
+      <w:r>
+        <w:rPr>
+          <w:rFonts w:ascii="Times New Roman" w:hAnsi="Times New Roman" w:eastAsia="Times New Roman" w:cs="Times New Roman"/>
+          <w:noProof w:val="0"/>
+          <w:sz w:val="22"/>
+          <w:szCs w:val="22"/>
+          <w:lang w:val="en-GB"/>
+        </w:rPr>
+        <w:t>representing</w:t>
+      </w:r>
+      <w:r>
+        <w:rPr>
+          <w:rFonts w:ascii="Times New Roman" w:hAnsi="Times New Roman" w:eastAsia="Times New Roman" w:cs="Times New Roman"/>
+          <w:noProof w:val="0"/>
+          <w:sz w:val="22"/>
+          <w:szCs w:val="22"/>
+          <w:lang w:val="en-GB"/>
+        </w:rPr>
+        <w:t xml:space="preserve"> a compound annual growth rate (CAGR) of 12.18%.</w:t>
       </w:r>
       <w:r>
         <w:rPr>
@@ -5012,27 +4253,27 @@
           <w:szCs w:val="22"/>
           <w:lang w:val="en-GB"/>
         </w:rPr>
-        <w:t>Europe’s str</w:t>
-      </w:r>
-      <w:r>
-        <w:rPr>
-          <w:rFonts w:ascii="Times New Roman" w:hAnsi="Times New Roman" w:eastAsia="Times New Roman" w:cs="Times New Roman"/>
-          <w:noProof w:val="0"/>
-          <w:sz w:val="22"/>
-          <w:szCs w:val="22"/>
-          <w:lang w:val="en-GB"/>
-        </w:rPr>
-        <w:t xml:space="preserve">ong </w:t>
-      </w:r>
-      <w:r>
-        <w:rPr>
-          <w:rFonts w:ascii="Times New Roman" w:hAnsi="Times New Roman" w:eastAsia="Times New Roman" w:cs="Times New Roman"/>
-          <w:noProof w:val="0"/>
-          <w:sz w:val="22"/>
-          <w:szCs w:val="22"/>
-          <w:lang w:val="en-GB"/>
-        </w:rPr>
-        <w:t xml:space="preserve">position in </w:t>
+        <w:t>This expansion is driven by the increasing number of smart city initiatives, developments in edge computing, and the widespread deployment of 5G networks.</w:t>
+      </w:r>
+      <w:r>
+        <w:rPr>
+          <w:rFonts w:ascii="Times New Roman" w:hAnsi="Times New Roman" w:eastAsia="Times New Roman" w:cs="Times New Roman"/>
+          <w:noProof w:val="0"/>
+          <w:sz w:val="22"/>
+          <w:szCs w:val="22"/>
+          <w:lang w:val="en-GB"/>
+        </w:rPr>
+        <w:t xml:space="preserve"> </w:t>
+      </w:r>
+      <w:r>
+        <w:rPr>
+          <w:rFonts w:ascii="Times New Roman" w:hAnsi="Times New Roman" w:eastAsia="Times New Roman" w:cs="Times New Roman"/>
+          <w:noProof w:val="0"/>
+          <w:sz w:val="22"/>
+          <w:szCs w:val="22"/>
+          <w:lang w:val="en-GB"/>
+        </w:rPr>
+        <w:t xml:space="preserve">The Centre for the Promotion of Imports (CBI, 2025) reports that Europe's broader IoT market is expected to grow from €179 billion in 2025 to €258 billion by 2029, with Europe holding the largest regional </w:t>
       </w:r>
       <w:r>
         <w:rPr>
@@ -5052,46 +4293,7 @@
           <w:szCs w:val="22"/>
           <w:lang w:val="en-GB"/>
         </w:rPr>
-        <w:t xml:space="preserve"> adoption is supported by its established manufacturing industry, government-led digital transformation strategies, and sustainability requirements under initiatives such as the European Green Deal.</w:t>
-      </w:r>
-    </w:p>
-    <w:p>
-      <w:pPr>
-        <w:spacing w:before="240" w:beforeAutospacing="off" w:after="240" w:afterAutospacing="off"/>
-        <w:jc w:val="left"/>
-        <w:rPr>
-          <w:rFonts w:ascii="Times New Roman" w:hAnsi="Times New Roman" w:eastAsia="Times New Roman" w:cs="Times New Roman"/>
-          <w:b w:val="1"/>
-          <w:bCs w:val="1"/>
-          <w:noProof w:val="0"/>
-          <w:sz w:val="22"/>
-          <w:szCs w:val="22"/>
-          <w:lang w:val="en-GB"/>
-        </w:rPr>
-      </w:pPr>
-      <w:r>
-        <w:rPr>
-          <w:rFonts w:ascii="Times New Roman" w:hAnsi="Times New Roman" w:eastAsia="Times New Roman" w:cs="Times New Roman"/>
-          <w:b w:val="1"/>
-          <w:bCs w:val="1"/>
-          <w:noProof w:val="0"/>
-          <w:sz w:val="22"/>
-          <w:szCs w:val="22"/>
-          <w:lang w:val="en-GB"/>
-        </w:rPr>
-        <w:t>IIoT</w:t>
-      </w:r>
-      <w:r>
-        <w:rPr>
-          <w:rFonts w:ascii="Times New Roman" w:hAnsi="Times New Roman" w:eastAsia="Times New Roman" w:cs="Times New Roman"/>
-          <w:b w:val="1"/>
-          <w:bCs w:val="1"/>
-          <w:noProof w:val="0"/>
-          <w:sz w:val="22"/>
-          <w:szCs w:val="22"/>
-          <w:lang w:val="en-GB"/>
-        </w:rPr>
-        <w:t xml:space="preserve"> in smart homes and energy relevance</w:t>
+        <w:t xml:space="preserve"> share globally due to its robust manufacturing base and strong government investment in digital infrastructure. </w:t>
       </w:r>
     </w:p>
     <w:p>
@@ -5115,7 +4317,37 @@
           <w:szCs w:val="22"/>
           <w:lang w:val="en-GB"/>
         </w:rPr>
-        <w:t>In the residential sector, IoT-based energy management systems are becoming increasingly important.</w:t>
+        <w:t xml:space="preserve">A core principle of </w:t>
+      </w:r>
+      <w:r>
+        <w:rPr>
+          <w:rFonts w:ascii="Times New Roman" w:hAnsi="Times New Roman" w:eastAsia="Times New Roman" w:cs="Times New Roman"/>
+          <w:noProof w:val="0"/>
+          <w:sz w:val="22"/>
+          <w:szCs w:val="22"/>
+          <w:lang w:val="en-GB"/>
+        </w:rPr>
+        <w:t>IIoT</w:t>
+      </w:r>
+      <w:r>
+        <w:rPr>
+          <w:rFonts w:ascii="Times New Roman" w:hAnsi="Times New Roman" w:eastAsia="Times New Roman" w:cs="Times New Roman"/>
+          <w:noProof w:val="0"/>
+          <w:sz w:val="22"/>
+          <w:szCs w:val="22"/>
+          <w:lang w:val="en-GB"/>
+        </w:rPr>
+        <w:t xml:space="preserve"> that has direct relevance to residential smart home applications is the integration of distributed sensor networks with real-time data processing</w:t>
+      </w:r>
+      <w:r>
+        <w:rPr>
+          <w:rFonts w:ascii="Times New Roman" w:hAnsi="Times New Roman" w:eastAsia="Times New Roman" w:cs="Times New Roman"/>
+          <w:noProof w:val="0"/>
+          <w:sz w:val="22"/>
+          <w:szCs w:val="22"/>
+          <w:lang w:val="en-GB"/>
+        </w:rPr>
+        <w:t>.</w:t>
       </w:r>
       <w:r>
         <w:rPr>
@@ -5135,77 +4367,77 @@
           <w:szCs w:val="22"/>
           <w:lang w:val="en-GB"/>
         </w:rPr>
-        <w:t>Bagdadee</w:t>
-      </w:r>
-      <w:r>
-        <w:rPr>
-          <w:rFonts w:ascii="Times New Roman" w:hAnsi="Times New Roman" w:eastAsia="Times New Roman" w:cs="Times New Roman"/>
-          <w:noProof w:val="0"/>
-          <w:sz w:val="22"/>
-          <w:szCs w:val="22"/>
-          <w:lang w:val="en-GB"/>
-        </w:rPr>
-        <w:t xml:space="preserve"> et al. (2025) </w:t>
-      </w:r>
-      <w:r>
-        <w:rPr>
-          <w:rFonts w:ascii="Times New Roman" w:hAnsi="Times New Roman" w:eastAsia="Times New Roman" w:cs="Times New Roman"/>
-          <w:noProof w:val="0"/>
-          <w:sz w:val="22"/>
-          <w:szCs w:val="22"/>
-          <w:lang w:val="en-GB"/>
-        </w:rPr>
-        <w:t>demonstrated</w:t>
-      </w:r>
-      <w:r>
-        <w:rPr>
-          <w:rFonts w:ascii="Times New Roman" w:hAnsi="Times New Roman" w:eastAsia="Times New Roman" w:cs="Times New Roman"/>
-          <w:noProof w:val="0"/>
-          <w:sz w:val="22"/>
-          <w:szCs w:val="22"/>
-          <w:lang w:val="en-GB"/>
-        </w:rPr>
-        <w:t xml:space="preserve"> that an IoT-based hybrid renewable energy system integrating solar panels, wind turbines, and battery </w:t>
-      </w:r>
-      <w:r>
-        <w:rPr>
-          <w:rFonts w:ascii="Times New Roman" w:hAnsi="Times New Roman" w:eastAsia="Times New Roman" w:cs="Times New Roman"/>
-          <w:noProof w:val="0"/>
-          <w:sz w:val="22"/>
-          <w:szCs w:val="22"/>
-          <w:lang w:val="en-GB"/>
-        </w:rPr>
-        <w:t xml:space="preserve">storage managed </w:t>
-      </w:r>
-      <w:r>
-        <w:rPr>
-          <w:rFonts w:ascii="Times New Roman" w:hAnsi="Times New Roman" w:eastAsia="Times New Roman" w:cs="Times New Roman"/>
-          <w:noProof w:val="0"/>
-          <w:sz w:val="22"/>
-          <w:szCs w:val="22"/>
-          <w:lang w:val="en-GB"/>
-        </w:rPr>
-        <w:t>through</w:t>
-      </w:r>
-      <w:r>
-        <w:rPr>
-          <w:rFonts w:ascii="Times New Roman" w:hAnsi="Times New Roman" w:eastAsia="Times New Roman" w:cs="Times New Roman"/>
-          <w:noProof w:val="0"/>
-          <w:sz w:val="22"/>
-          <w:szCs w:val="22"/>
-          <w:lang w:val="en-GB"/>
-        </w:rPr>
-        <w:t xml:space="preserve"> sensors using Zigbee, Z-Wave, and Wi-Fi protocols achieved 80% system efficiency and reduced energy costs by 61% compared to conventional grid-connected systems. </w:t>
-      </w:r>
-      <w:r>
-        <w:rPr>
-          <w:rFonts w:ascii="Times New Roman" w:hAnsi="Times New Roman" w:eastAsia="Times New Roman" w:cs="Times New Roman"/>
-          <w:noProof w:val="0"/>
-          <w:sz w:val="22"/>
-          <w:szCs w:val="22"/>
-          <w:lang w:val="en-GB"/>
-        </w:rPr>
-        <w:t>Real-time monitoring through IoT sensors enabled adaptive control of energy flows, directly reducing CO₂ emissions by over 61%</w:t>
+        <w:t xml:space="preserve">Bagdadee et al. (2025) </w:t>
+      </w:r>
+      <w:r>
+        <w:rPr>
+          <w:rFonts w:ascii="Times New Roman" w:hAnsi="Times New Roman" w:eastAsia="Times New Roman" w:cs="Times New Roman"/>
+          <w:noProof w:val="0"/>
+          <w:sz w:val="22"/>
+          <w:szCs w:val="22"/>
+          <w:lang w:val="en-GB"/>
+        </w:rPr>
+        <w:t>validated</w:t>
+      </w:r>
+      <w:r>
+        <w:rPr>
+          <w:rFonts w:ascii="Times New Roman" w:hAnsi="Times New Roman" w:eastAsia="Times New Roman" w:cs="Times New Roman"/>
+          <w:noProof w:val="0"/>
+          <w:sz w:val="22"/>
+          <w:szCs w:val="22"/>
+          <w:lang w:val="en-GB"/>
+        </w:rPr>
+        <w:t xml:space="preserve"> this concept</w:t>
+      </w:r>
+      <w:r>
+        <w:rPr>
+          <w:rFonts w:ascii="Times New Roman" w:hAnsi="Times New Roman" w:eastAsia="Times New Roman" w:cs="Times New Roman"/>
+          <w:noProof w:val="0"/>
+          <w:sz w:val="22"/>
+          <w:szCs w:val="22"/>
+          <w:lang w:val="en-GB"/>
+        </w:rPr>
+        <w:t>, showing that an IoT-based hybrid energy system</w:t>
+      </w:r>
+      <w:r>
+        <w:rPr>
+          <w:rFonts w:ascii="Times New Roman" w:hAnsi="Times New Roman" w:eastAsia="Times New Roman" w:cs="Times New Roman"/>
+          <w:noProof w:val="0"/>
+          <w:sz w:val="22"/>
+          <w:szCs w:val="22"/>
+          <w:lang w:val="en-GB"/>
+        </w:rPr>
+        <w:t xml:space="preserve"> </w:t>
+      </w:r>
+      <w:r>
+        <w:rPr>
+          <w:rFonts w:ascii="Times New Roman" w:hAnsi="Times New Roman" w:eastAsia="Times New Roman" w:cs="Times New Roman"/>
+          <w:noProof w:val="0"/>
+          <w:sz w:val="22"/>
+          <w:szCs w:val="22"/>
+          <w:lang w:val="en-GB"/>
+        </w:rPr>
+        <w:t>integrating solar panels, wind turbines, and battery storage through Zigbee, Z-Wave, and Wi-Fi communication protocols</w:t>
+      </w:r>
+      <w:r>
+        <w:rPr>
+          <w:rFonts w:ascii="Times New Roman" w:hAnsi="Times New Roman" w:eastAsia="Times New Roman" w:cs="Times New Roman"/>
+          <w:noProof w:val="0"/>
+          <w:sz w:val="22"/>
+          <w:szCs w:val="22"/>
+          <w:lang w:val="en-GB"/>
+        </w:rPr>
+        <w:t xml:space="preserve"> </w:t>
+      </w:r>
+      <w:r>
+        <w:rPr>
+          <w:rFonts w:ascii="Times New Roman" w:hAnsi="Times New Roman" w:eastAsia="Times New Roman" w:cs="Times New Roman"/>
+          <w:noProof w:val="0"/>
+          <w:sz w:val="22"/>
+          <w:szCs w:val="22"/>
+          <w:lang w:val="en-GB"/>
+        </w:rPr>
+        <w:t>achieved 80% system efficiency and reduced energy costs by 61% compared to conventional grid-connected systems</w:t>
       </w:r>
       <w:r>
         <w:rPr>
@@ -5225,7 +4457,47 @@
           <w:szCs w:val="22"/>
           <w:lang w:val="en-GB"/>
         </w:rPr>
-        <w:t xml:space="preserve">This highlights the practical value of </w:t>
+        <w:t>CO₂ emissions were also reduced by over 61</w:t>
+      </w:r>
+      <w:r>
+        <w:rPr>
+          <w:rFonts w:ascii="Times New Roman" w:hAnsi="Times New Roman" w:eastAsia="Times New Roman" w:cs="Times New Roman"/>
+          <w:noProof w:val="0"/>
+          <w:sz w:val="22"/>
+          <w:szCs w:val="22"/>
+          <w:lang w:val="en-GB"/>
+        </w:rPr>
+        <w:t>%. These</w:t>
+      </w:r>
+      <w:r>
+        <w:rPr>
+          <w:rFonts w:ascii="Times New Roman" w:hAnsi="Times New Roman" w:eastAsia="Times New Roman" w:cs="Times New Roman"/>
+          <w:noProof w:val="0"/>
+          <w:sz w:val="22"/>
+          <w:szCs w:val="22"/>
+          <w:lang w:val="en-GB"/>
+        </w:rPr>
+        <w:t xml:space="preserve"> improvements are credited to real-time monitoring and adaptive energy management using IoT sensors and controllers, </w:t>
+      </w:r>
+      <w:r>
+        <w:rPr>
+          <w:rFonts w:ascii="Times New Roman" w:hAnsi="Times New Roman" w:eastAsia="Times New Roman" w:cs="Times New Roman"/>
+          <w:noProof w:val="0"/>
+          <w:sz w:val="22"/>
+          <w:szCs w:val="22"/>
+          <w:lang w:val="en-GB"/>
+        </w:rPr>
+        <w:t>showing</w:t>
+      </w:r>
+      <w:r>
+        <w:rPr>
+          <w:rFonts w:ascii="Times New Roman" w:hAnsi="Times New Roman" w:eastAsia="Times New Roman" w:cs="Times New Roman"/>
+          <w:noProof w:val="0"/>
+          <w:sz w:val="22"/>
+          <w:szCs w:val="22"/>
+          <w:lang w:val="en-GB"/>
+        </w:rPr>
+        <w:t xml:space="preserve"> that </w:t>
       </w:r>
       <w:r>
         <w:rPr>
@@ -5245,147 +4517,47 @@
           <w:szCs w:val="22"/>
           <w:lang w:val="en-GB"/>
         </w:rPr>
-        <w:t xml:space="preserve"> principles </w:t>
-      </w:r>
-      <w:r>
-        <w:rPr>
-          <w:rFonts w:ascii="Times New Roman" w:hAnsi="Times New Roman" w:eastAsia="Times New Roman" w:cs="Times New Roman"/>
-          <w:noProof w:val="0"/>
-          <w:sz w:val="22"/>
-          <w:szCs w:val="22"/>
-          <w:lang w:val="en-GB"/>
-        </w:rPr>
-        <w:t xml:space="preserve">being </w:t>
-      </w:r>
-      <w:r>
-        <w:rPr>
-          <w:rFonts w:ascii="Times New Roman" w:hAnsi="Times New Roman" w:eastAsia="Times New Roman" w:cs="Times New Roman"/>
-          <w:noProof w:val="0"/>
-          <w:sz w:val="22"/>
-          <w:szCs w:val="22"/>
-          <w:lang w:val="en-GB"/>
-        </w:rPr>
-        <w:t xml:space="preserve">applied at residential </w:t>
-      </w:r>
-      <w:r>
-        <w:rPr>
-          <w:rFonts w:ascii="Times New Roman" w:hAnsi="Times New Roman" w:eastAsia="Times New Roman" w:cs="Times New Roman"/>
-          <w:noProof w:val="0"/>
-          <w:sz w:val="22"/>
-          <w:szCs w:val="22"/>
-          <w:lang w:val="en-GB"/>
-        </w:rPr>
-        <w:t>environments</w:t>
-      </w:r>
-      <w:r>
-        <w:rPr>
-          <w:rFonts w:ascii="Times New Roman" w:hAnsi="Times New Roman" w:eastAsia="Times New Roman" w:cs="Times New Roman"/>
-          <w:noProof w:val="0"/>
-          <w:sz w:val="22"/>
-          <w:szCs w:val="22"/>
-          <w:lang w:val="en-GB"/>
-        </w:rPr>
-        <w:t xml:space="preserve">, where distributed sensing, real-time feedback, and automated </w:t>
-      </w:r>
-      <w:r>
-        <w:rPr>
-          <w:rFonts w:ascii="Times New Roman" w:hAnsi="Times New Roman" w:eastAsia="Times New Roman" w:cs="Times New Roman"/>
-          <w:noProof w:val="0"/>
-          <w:sz w:val="22"/>
-          <w:szCs w:val="22"/>
-          <w:lang w:val="en-GB"/>
-        </w:rPr>
-        <w:t xml:space="preserve">operation </w:t>
-      </w:r>
-      <w:r>
-        <w:rPr>
-          <w:rFonts w:ascii="Times New Roman" w:hAnsi="Times New Roman" w:eastAsia="Times New Roman" w:cs="Times New Roman"/>
-          <w:noProof w:val="0"/>
-          <w:sz w:val="22"/>
-          <w:szCs w:val="22"/>
-          <w:lang w:val="en-GB"/>
-        </w:rPr>
-        <w:t>work together to optimise resource use</w:t>
-      </w:r>
-      <w:r>
-        <w:rPr>
-          <w:rFonts w:ascii="Times New Roman" w:hAnsi="Times New Roman" w:eastAsia="Times New Roman" w:cs="Times New Roman"/>
-          <w:noProof w:val="0"/>
-          <w:sz w:val="22"/>
-          <w:szCs w:val="22"/>
-          <w:lang w:val="en-GB"/>
-        </w:rPr>
-        <w:t>.</w:t>
-      </w:r>
-      <w:r>
-        <w:rPr>
-          <w:rFonts w:ascii="Times New Roman" w:hAnsi="Times New Roman" w:eastAsia="Times New Roman" w:cs="Times New Roman"/>
-          <w:noProof w:val="0"/>
-          <w:sz w:val="22"/>
-          <w:szCs w:val="22"/>
-          <w:lang w:val="en-GB"/>
-        </w:rPr>
-        <w:t xml:space="preserve"> According to Mordor </w:t>
-      </w:r>
-      <w:r>
-        <w:rPr>
-          <w:rFonts w:ascii="Times New Roman" w:hAnsi="Times New Roman" w:eastAsia="Times New Roman" w:cs="Times New Roman"/>
-          <w:noProof w:val="0"/>
-          <w:sz w:val="22"/>
-          <w:szCs w:val="22"/>
-          <w:lang w:val="en-GB"/>
-        </w:rPr>
-        <w:t>Intelligence (2025)</w:t>
-      </w:r>
-      <w:r>
-        <w:rPr>
-          <w:rFonts w:ascii="Times New Roman" w:hAnsi="Times New Roman" w:eastAsia="Times New Roman" w:cs="Times New Roman"/>
-          <w:noProof w:val="0"/>
-          <w:sz w:val="22"/>
-          <w:szCs w:val="22"/>
-          <w:lang w:val="en-GB"/>
-        </w:rPr>
-        <w:t xml:space="preserve">, the </w:t>
-      </w:r>
-      <w:r>
-        <w:rPr>
-          <w:rFonts w:ascii="Times New Roman" w:hAnsi="Times New Roman" w:eastAsia="Times New Roman" w:cs="Times New Roman"/>
-          <w:noProof w:val="0"/>
-          <w:sz w:val="22"/>
-          <w:szCs w:val="22"/>
-          <w:lang w:val="en-GB"/>
-        </w:rPr>
-        <w:t xml:space="preserve">European smart homes market </w:t>
-      </w:r>
-      <w:r>
-        <w:rPr>
-          <w:rFonts w:ascii="Times New Roman" w:hAnsi="Times New Roman" w:eastAsia="Times New Roman" w:cs="Times New Roman"/>
-          <w:noProof w:val="0"/>
-          <w:sz w:val="22"/>
-          <w:szCs w:val="22"/>
-          <w:lang w:val="en-GB"/>
-        </w:rPr>
-        <w:t>was</w:t>
-      </w:r>
-      <w:r>
-        <w:rPr>
-          <w:rFonts w:ascii="Times New Roman" w:hAnsi="Times New Roman" w:eastAsia="Times New Roman" w:cs="Times New Roman"/>
-          <w:noProof w:val="0"/>
-          <w:sz w:val="22"/>
-          <w:szCs w:val="22"/>
-          <w:lang w:val="en-GB"/>
-        </w:rPr>
-        <w:t xml:space="preserve"> valued at USD 23.14 billion in 2025 and is expected to grow to USD 32.12 billion by 2031, driven by energy efficiency regulations, automated load-shifting requirements, and dynamic electricity pricing</w:t>
-      </w:r>
-      <w:r>
-        <w:rPr>
-          <w:rFonts w:ascii="Times New Roman" w:hAnsi="Times New Roman" w:eastAsia="Times New Roman" w:cs="Times New Roman"/>
-          <w:noProof w:val="0"/>
-          <w:sz w:val="22"/>
-          <w:szCs w:val="22"/>
-          <w:lang w:val="en-GB"/>
-        </w:rPr>
-        <w:t>,</w:t>
+        <w:t xml:space="preserve"> principles such as distributed sensing, centralised control, and automated actuation</w:t>
+      </w:r>
+      <w:r>
+        <w:rPr>
+          <w:rFonts w:ascii="Times New Roman" w:hAnsi="Times New Roman" w:eastAsia="Times New Roman" w:cs="Times New Roman"/>
+          <w:noProof w:val="0"/>
+          <w:sz w:val="22"/>
+          <w:szCs w:val="22"/>
+          <w:lang w:val="en-GB"/>
+        </w:rPr>
+        <w:t xml:space="preserve"> </w:t>
+      </w:r>
+      <w:r>
+        <w:rPr>
+          <w:rFonts w:ascii="Times New Roman" w:hAnsi="Times New Roman" w:eastAsia="Times New Roman" w:cs="Times New Roman"/>
+          <w:noProof w:val="0"/>
+          <w:sz w:val="22"/>
+          <w:szCs w:val="22"/>
+          <w:lang w:val="en-GB"/>
+        </w:rPr>
+        <w:t>produce measurable efficiency gains in residential environments.</w:t>
+      </w:r>
+      <w:r>
+        <w:rPr>
+          <w:rFonts w:ascii="Times New Roman" w:hAnsi="Times New Roman" w:eastAsia="Times New Roman" w:cs="Times New Roman"/>
+          <w:noProof w:val="0"/>
+          <w:sz w:val="22"/>
+          <w:szCs w:val="22"/>
+          <w:lang w:val="en-GB"/>
+        </w:rPr>
+        <w:t xml:space="preserve"> </w:t>
+      </w:r>
+      <w:r>
+        <w:rPr>
+          <w:rFonts w:ascii="Times New Roman" w:hAnsi="Times New Roman" w:eastAsia="Times New Roman" w:cs="Times New Roman"/>
+          <w:noProof w:val="0"/>
+          <w:sz w:val="22"/>
+          <w:szCs w:val="22"/>
+          <w:lang w:val="en-GB"/>
+        </w:rPr>
+        <w:t>According to Mordor Intelligence (2025), the European smart homes market was valued at USD 23.14 billion in 2025 and is expected to grow to USD 32.12 billion by 2031, driven by energy efficiency regulations, automated load-shifting requirements, and dynamic electricity pricing,</w:t>
       </w:r>
       <w:r>
         <w:rPr>
@@ -5437,44 +4609,7 @@
           <w:szCs w:val="22"/>
           <w:lang w:val="en-GB"/>
         </w:rPr>
-        <w:t>)</w:t>
-      </w:r>
-      <w:r>
-        <w:rPr>
-          <w:rFonts w:ascii="Times New Roman" w:hAnsi="Times New Roman" w:eastAsia="Times New Roman" w:cs="Times New Roman"/>
-          <w:noProof w:val="0"/>
-          <w:sz w:val="22"/>
-          <w:szCs w:val="22"/>
-          <w:lang w:val="en-GB"/>
-        </w:rPr>
-        <w:t xml:space="preserve"> provides.</w:t>
-      </w:r>
-    </w:p>
-    <w:p>
-      <w:pPr>
-        <w:spacing w:before="240" w:beforeAutospacing="off" w:after="240" w:afterAutospacing="off"/>
-        <w:jc w:val="left"/>
-        <w:rPr>
-          <w:rFonts w:ascii="Times New Roman" w:hAnsi="Times New Roman" w:eastAsia="Times New Roman" w:cs="Times New Roman"/>
-          <w:b w:val="1"/>
-          <w:bCs w:val="1"/>
-          <w:noProof w:val="0"/>
-          <w:sz w:val="22"/>
-          <w:szCs w:val="22"/>
-          <w:lang w:val="en-GB"/>
-        </w:rPr>
-      </w:pPr>
-      <w:r>
-        <w:rPr>
-          <w:rFonts w:ascii="Times New Roman" w:hAnsi="Times New Roman" w:eastAsia="Times New Roman" w:cs="Times New Roman"/>
-          <w:b w:val="1"/>
-          <w:bCs w:val="1"/>
-          <w:noProof w:val="0"/>
-          <w:sz w:val="22"/>
-          <w:szCs w:val="22"/>
-          <w:lang w:val="en-GB"/>
-        </w:rPr>
-        <w:t>Scalability, Poland, and the DIY link</w:t>
+        <w:t>) provides.</w:t>
       </w:r>
     </w:p>
     <w:p>
@@ -5482,351 +4617,342 @@
         <w:pStyle w:val="Normal"/>
         <w:spacing w:before="240" w:beforeAutospacing="off" w:after="240" w:afterAutospacing="off"/>
         <w:jc w:val="left"/>
-      </w:pPr>
-      <w:r>
-        <w:rPr>
-          <w:rFonts w:ascii="Times New Roman" w:hAnsi="Times New Roman" w:eastAsia="Times New Roman" w:cs="Times New Roman"/>
-          <w:noProof w:val="0"/>
-          <w:sz w:val="22"/>
-          <w:szCs w:val="22"/>
-          <w:lang w:val="en-GB"/>
-        </w:rPr>
-        <w:t>Ezugwu et al. (2025</w:t>
-      </w:r>
-      <w:r>
-        <w:rPr>
-          <w:rFonts w:ascii="Times New Roman" w:hAnsi="Times New Roman" w:eastAsia="Times New Roman" w:cs="Times New Roman"/>
-          <w:noProof w:val="0"/>
-          <w:sz w:val="22"/>
-          <w:szCs w:val="22"/>
-          <w:lang w:val="en-GB"/>
-        </w:rPr>
-        <w:t>) states</w:t>
-      </w:r>
-      <w:r>
-        <w:rPr>
-          <w:rFonts w:ascii="Times New Roman" w:hAnsi="Times New Roman" w:eastAsia="Times New Roman" w:cs="Times New Roman"/>
-          <w:noProof w:val="0"/>
-          <w:sz w:val="22"/>
-          <w:szCs w:val="22"/>
-          <w:lang w:val="en-GB"/>
-        </w:rPr>
-        <w:t xml:space="preserve"> that h</w:t>
-      </w:r>
-      <w:r>
-        <w:rPr>
-          <w:rFonts w:ascii="Times New Roman" w:hAnsi="Times New Roman" w:eastAsia="Times New Roman" w:cs="Times New Roman"/>
-          <w:noProof w:val="0"/>
-          <w:sz w:val="22"/>
-          <w:szCs w:val="22"/>
-          <w:lang w:val="en-GB"/>
-        </w:rPr>
-        <w:t>ome automation developers rely on hardware from multiple manufacturers, which often leads to systems that are not fully scalable</w:t>
-      </w:r>
-      <w:r>
-        <w:rPr>
-          <w:rFonts w:ascii="Times New Roman" w:hAnsi="Times New Roman" w:eastAsia="Times New Roman" w:cs="Times New Roman"/>
-          <w:noProof w:val="0"/>
-          <w:sz w:val="22"/>
-          <w:szCs w:val="22"/>
-          <w:lang w:val="en-GB"/>
-        </w:rPr>
-        <w:t xml:space="preserve"> or compatible</w:t>
-      </w:r>
-      <w:r>
-        <w:rPr>
-          <w:rFonts w:ascii="Times New Roman" w:hAnsi="Times New Roman" w:eastAsia="Times New Roman" w:cs="Times New Roman"/>
-          <w:noProof w:val="0"/>
-          <w:sz w:val="22"/>
-          <w:szCs w:val="22"/>
-          <w:lang w:val="en-GB"/>
-        </w:rPr>
-        <w:t xml:space="preserve">. Differences in IoT hardware standards can cause communication and connectivity problems between devices. </w:t>
-      </w:r>
-      <w:r>
-        <w:rPr>
-          <w:rFonts w:ascii="Times New Roman" w:hAnsi="Times New Roman" w:eastAsia="Times New Roman" w:cs="Times New Roman"/>
-          <w:noProof w:val="0"/>
-          <w:sz w:val="22"/>
-          <w:szCs w:val="22"/>
-          <w:lang w:val="en-GB"/>
-        </w:rPr>
-        <w:t xml:space="preserve">The integration of AI with IoT transforms systems from simple monitoring tools into predictive solutions capable of </w:t>
-      </w:r>
-      <w:r>
-        <w:rPr>
-          <w:rFonts w:ascii="Times New Roman" w:hAnsi="Times New Roman" w:eastAsia="Times New Roman" w:cs="Times New Roman"/>
-          <w:noProof w:val="0"/>
-          <w:sz w:val="22"/>
-          <w:szCs w:val="22"/>
-          <w:lang w:val="en-GB"/>
-        </w:rPr>
-        <w:t>identifying</w:t>
-      </w:r>
-      <w:r>
-        <w:rPr>
-          <w:rFonts w:ascii="Times New Roman" w:hAnsi="Times New Roman" w:eastAsia="Times New Roman" w:cs="Times New Roman"/>
-          <w:noProof w:val="0"/>
-          <w:sz w:val="22"/>
-          <w:szCs w:val="22"/>
-          <w:lang w:val="en-GB"/>
-        </w:rPr>
-        <w:t xml:space="preserve"> and preventing potential issues within the home environment.</w:t>
-      </w:r>
-      <w:r>
-        <w:rPr>
-          <w:rFonts w:ascii="Times New Roman" w:hAnsi="Times New Roman" w:eastAsia="Times New Roman" w:cs="Times New Roman"/>
-          <w:noProof w:val="0"/>
-          <w:sz w:val="22"/>
-          <w:szCs w:val="22"/>
-          <w:lang w:val="en-GB"/>
-        </w:rPr>
-        <w:t xml:space="preserve"> </w:t>
-      </w:r>
-      <w:r>
-        <w:rPr>
-          <w:rFonts w:ascii="Times New Roman" w:hAnsi="Times New Roman" w:eastAsia="Times New Roman" w:cs="Times New Roman"/>
-          <w:noProof w:val="0"/>
-          <w:sz w:val="22"/>
-          <w:szCs w:val="22"/>
-          <w:lang w:val="en-GB"/>
-        </w:rPr>
-        <w:t>However, these</w:t>
-      </w:r>
-      <w:r>
-        <w:rPr>
-          <w:rFonts w:ascii="Times New Roman" w:hAnsi="Times New Roman" w:eastAsia="Times New Roman" w:cs="Times New Roman"/>
-          <w:noProof w:val="0"/>
-          <w:sz w:val="22"/>
-          <w:szCs w:val="22"/>
-          <w:lang w:val="en-GB"/>
-        </w:rPr>
-        <w:t xml:space="preserve"> advanced</w:t>
-      </w:r>
-      <w:r>
-        <w:rPr>
-          <w:rFonts w:ascii="Times New Roman" w:hAnsi="Times New Roman" w:eastAsia="Times New Roman" w:cs="Times New Roman"/>
-          <w:noProof w:val="0"/>
-          <w:sz w:val="22"/>
-          <w:szCs w:val="22"/>
-          <w:lang w:val="en-GB"/>
-        </w:rPr>
-        <w:t xml:space="preserve"> systems often demand high processing power and </w:t>
-      </w:r>
-      <w:r>
-        <w:rPr>
-          <w:rFonts w:ascii="Times New Roman" w:hAnsi="Times New Roman" w:eastAsia="Times New Roman" w:cs="Times New Roman"/>
-          <w:noProof w:val="0"/>
-          <w:sz w:val="22"/>
-          <w:szCs w:val="22"/>
-          <w:lang w:val="en-GB"/>
-        </w:rPr>
-        <w:t xml:space="preserve">infrastructure </w:t>
-      </w:r>
-      <w:r>
-        <w:rPr>
-          <w:rFonts w:ascii="Times New Roman" w:hAnsi="Times New Roman" w:eastAsia="Times New Roman" w:cs="Times New Roman"/>
-          <w:noProof w:val="0"/>
-          <w:sz w:val="22"/>
-          <w:szCs w:val="22"/>
-          <w:lang w:val="en-GB"/>
-        </w:rPr>
-        <w:t>investment.</w:t>
-      </w:r>
-      <w:r>
-        <w:rPr>
-          <w:rFonts w:ascii="Times New Roman" w:hAnsi="Times New Roman" w:eastAsia="Times New Roman" w:cs="Times New Roman"/>
-          <w:noProof w:val="0"/>
-          <w:sz w:val="22"/>
-          <w:szCs w:val="22"/>
-          <w:lang w:val="en-GB"/>
-        </w:rPr>
-        <w:t xml:space="preserve"> </w:t>
-      </w:r>
-      <w:r>
-        <w:rPr>
-          <w:rFonts w:ascii="Times New Roman" w:hAnsi="Times New Roman" w:eastAsia="Times New Roman" w:cs="Times New Roman"/>
-          <w:noProof w:val="0"/>
-          <w:sz w:val="22"/>
-          <w:szCs w:val="22"/>
-          <w:lang w:val="en-GB"/>
-        </w:rPr>
-        <w:t>CBI (2025</w:t>
-      </w:r>
-      <w:r>
-        <w:rPr>
-          <w:rFonts w:ascii="Times New Roman" w:hAnsi="Times New Roman" w:eastAsia="Times New Roman" w:cs="Times New Roman"/>
-          <w:noProof w:val="0"/>
-          <w:sz w:val="22"/>
-          <w:szCs w:val="22"/>
-          <w:lang w:val="en-GB"/>
-        </w:rPr>
-        <w:t>) reports</w:t>
-      </w:r>
-      <w:r>
-        <w:rPr>
-          <w:rFonts w:ascii="Times New Roman" w:hAnsi="Times New Roman" w:eastAsia="Times New Roman" w:cs="Times New Roman"/>
-          <w:noProof w:val="0"/>
-          <w:sz w:val="22"/>
-          <w:szCs w:val="22"/>
-          <w:lang w:val="en-GB"/>
-        </w:rPr>
-        <w:t xml:space="preserve"> that Poland is one of Europe’s fastest-growing IoT markets, with a projected CAGR of 12.06% through 2029, driven by key sectors such as manufacturing, energy, and </w:t>
-      </w:r>
-      <w:r>
-        <w:rPr>
-          <w:rFonts w:ascii="Times New Roman" w:hAnsi="Times New Roman" w:eastAsia="Times New Roman" w:cs="Times New Roman"/>
-          <w:noProof w:val="0"/>
-          <w:sz w:val="22"/>
-          <w:szCs w:val="22"/>
-          <w:lang w:val="en-GB"/>
-        </w:rPr>
-        <w:t>logistics</w:t>
-      </w:r>
-      <w:r>
-        <w:rPr>
-          <w:rFonts w:ascii="Times New Roman" w:hAnsi="Times New Roman" w:eastAsia="Times New Roman" w:cs="Times New Roman"/>
-          <w:noProof w:val="0"/>
-          <w:sz w:val="22"/>
-          <w:szCs w:val="22"/>
-          <w:lang w:val="en-GB"/>
-        </w:rPr>
-        <w:t>.</w:t>
-      </w:r>
-      <w:r>
-        <w:rPr>
-          <w:rFonts w:ascii="Times New Roman" w:hAnsi="Times New Roman" w:eastAsia="Times New Roman" w:cs="Times New Roman"/>
-          <w:noProof w:val="0"/>
-          <w:sz w:val="22"/>
-          <w:szCs w:val="22"/>
-          <w:lang w:val="en-GB"/>
-        </w:rPr>
-        <w:t xml:space="preserve"> </w:t>
-      </w:r>
-      <w:r>
-        <w:rPr>
-          <w:rFonts w:ascii="Times New Roman" w:hAnsi="Times New Roman" w:eastAsia="Times New Roman" w:cs="Times New Roman"/>
-          <w:noProof w:val="0"/>
-          <w:sz w:val="22"/>
-          <w:szCs w:val="22"/>
-          <w:lang w:val="en-GB"/>
-        </w:rPr>
-        <w:t xml:space="preserve">For most households, high-level </w:t>
-      </w:r>
-      <w:r>
-        <w:rPr>
-          <w:rFonts w:ascii="Times New Roman" w:hAnsi="Times New Roman" w:eastAsia="Times New Roman" w:cs="Times New Roman"/>
-          <w:noProof w:val="0"/>
-          <w:sz w:val="22"/>
-          <w:szCs w:val="22"/>
-          <w:lang w:val="en-GB"/>
-        </w:rPr>
-        <w:t>IIoT</w:t>
-      </w:r>
-      <w:r>
-        <w:rPr>
-          <w:rFonts w:ascii="Times New Roman" w:hAnsi="Times New Roman" w:eastAsia="Times New Roman" w:cs="Times New Roman"/>
-          <w:noProof w:val="0"/>
-          <w:sz w:val="22"/>
-          <w:szCs w:val="22"/>
-          <w:lang w:val="en-GB"/>
-        </w:rPr>
-        <w:t xml:space="preserve"> systems are too expensive and complex to implement. Platforms like Home Assistant, when deployed on a Raspberry Pi 4, help bridge this gap by offering a low-cost, open-source alternative.</w:t>
-      </w:r>
-      <w:r>
-        <w:rPr>
-          <w:rFonts w:ascii="Times New Roman" w:hAnsi="Times New Roman" w:eastAsia="Times New Roman" w:cs="Times New Roman"/>
-          <w:noProof w:val="0"/>
-          <w:sz w:val="22"/>
-          <w:szCs w:val="22"/>
-          <w:lang w:val="en-GB"/>
-        </w:rPr>
-        <w:t xml:space="preserve"> </w:t>
-      </w:r>
-      <w:r>
-        <w:rPr>
-          <w:rFonts w:ascii="Times New Roman" w:hAnsi="Times New Roman" w:eastAsia="Times New Roman" w:cs="Times New Roman"/>
-          <w:noProof w:val="0"/>
-          <w:sz w:val="22"/>
-          <w:szCs w:val="22"/>
-          <w:lang w:val="en-GB"/>
-        </w:rPr>
-        <w:t xml:space="preserve">The system developed in this thesis applies a layered </w:t>
-      </w:r>
-      <w:r>
-        <w:rPr>
-          <w:rFonts w:ascii="Times New Roman" w:hAnsi="Times New Roman" w:eastAsia="Times New Roman" w:cs="Times New Roman"/>
-          <w:noProof w:val="0"/>
-          <w:sz w:val="22"/>
-          <w:szCs w:val="22"/>
-          <w:lang w:val="en-GB"/>
-        </w:rPr>
-        <w:t>IIoT</w:t>
-      </w:r>
-      <w:r>
-        <w:rPr>
-          <w:rFonts w:ascii="Times New Roman" w:hAnsi="Times New Roman" w:eastAsia="Times New Roman" w:cs="Times New Roman"/>
-          <w:noProof w:val="0"/>
-          <w:sz w:val="22"/>
-          <w:szCs w:val="22"/>
-          <w:lang w:val="en-GB"/>
-        </w:rPr>
-        <w:t xml:space="preserve"> architecture (sensor, gateway, and control) at </w:t>
-      </w:r>
-      <w:r>
-        <w:rPr>
-          <w:rFonts w:ascii="Times New Roman" w:hAnsi="Times New Roman" w:eastAsia="Times New Roman" w:cs="Times New Roman"/>
-          <w:noProof w:val="0"/>
-          <w:sz w:val="22"/>
-          <w:szCs w:val="22"/>
-          <w:lang w:val="en-GB"/>
-        </w:rPr>
-        <w:t>a</w:t>
-      </w:r>
-      <w:r>
-        <w:rPr>
-          <w:rFonts w:ascii="Times New Roman" w:hAnsi="Times New Roman" w:eastAsia="Times New Roman" w:cs="Times New Roman"/>
-          <w:noProof w:val="0"/>
-          <w:sz w:val="22"/>
-          <w:szCs w:val="22"/>
-          <w:lang w:val="en-GB"/>
-        </w:rPr>
-        <w:t xml:space="preserve"> household scale, making </w:t>
-      </w:r>
-      <w:r>
-        <w:rPr>
-          <w:rFonts w:ascii="Times New Roman" w:hAnsi="Times New Roman" w:eastAsia="Times New Roman" w:cs="Times New Roman"/>
-          <w:noProof w:val="0"/>
-          <w:sz w:val="22"/>
-          <w:szCs w:val="22"/>
-          <w:lang w:val="en-GB"/>
-        </w:rPr>
-        <w:t>IIoT</w:t>
-      </w:r>
-      <w:r>
-        <w:rPr>
-          <w:rFonts w:ascii="Times New Roman" w:hAnsi="Times New Roman" w:eastAsia="Times New Roman" w:cs="Times New Roman"/>
-          <w:noProof w:val="0"/>
-          <w:sz w:val="22"/>
-          <w:szCs w:val="22"/>
-          <w:lang w:val="en-GB"/>
-        </w:rPr>
-        <w:t xml:space="preserve"> functionality accessible to ordinary users without significant costs.</w:t>
-      </w:r>
+        <w:rPr>
+          <w:rFonts w:ascii="Times New Roman" w:hAnsi="Times New Roman" w:eastAsia="Times New Roman" w:cs="Times New Roman"/>
+          <w:noProof w:val="0"/>
+          <w:sz w:val="22"/>
+          <w:szCs w:val="22"/>
+          <w:lang w:val="en-GB"/>
+        </w:rPr>
+      </w:pPr>
     </w:p>
     <w:p>
       <w:pPr>
         <w:pStyle w:val="Normal"/>
         <w:spacing w:before="240" w:beforeAutospacing="off" w:after="240" w:afterAutospacing="off"/>
         <w:jc w:val="left"/>
-        <w:rPr>
-          <w:rFonts w:ascii="Times New Roman" w:hAnsi="Times New Roman" w:eastAsia="Times New Roman" w:cs="Times New Roman"/>
-          <w:noProof w:val="0"/>
-          <w:sz w:val="22"/>
-          <w:szCs w:val="22"/>
-          <w:lang w:val="en-GB"/>
-        </w:rPr>
-      </w:pPr>
+      </w:pPr>
+      <w:r>
+        <w:rPr>
+          <w:rFonts w:ascii="Times New Roman" w:hAnsi="Times New Roman" w:eastAsia="Times New Roman" w:cs="Times New Roman"/>
+          <w:noProof w:val="0"/>
+          <w:sz w:val="22"/>
+          <w:szCs w:val="22"/>
+          <w:lang w:val="en-GB"/>
+        </w:rPr>
+        <w:t>In addition to energy management, the integration of AI and IoT enables predictive and adaptive features that enhance smart home systems beyond simple reactive automation.</w:t>
+      </w:r>
+      <w:r>
+        <w:rPr>
+          <w:rFonts w:ascii="Times New Roman" w:hAnsi="Times New Roman" w:eastAsia="Times New Roman" w:cs="Times New Roman"/>
+          <w:noProof w:val="0"/>
+          <w:sz w:val="22"/>
+          <w:szCs w:val="22"/>
+          <w:lang w:val="en-GB"/>
+        </w:rPr>
+        <w:t xml:space="preserve"> </w:t>
+      </w:r>
+      <w:r>
+        <w:rPr>
+          <w:rFonts w:ascii="Times New Roman" w:hAnsi="Times New Roman" w:eastAsia="Times New Roman" w:cs="Times New Roman"/>
+          <w:noProof w:val="0"/>
+          <w:sz w:val="22"/>
+          <w:szCs w:val="22"/>
+          <w:lang w:val="en-GB"/>
+        </w:rPr>
+        <w:t>Ezugwu et al. (2025) states that</w:t>
+      </w:r>
+      <w:r>
+        <w:rPr>
+          <w:rFonts w:ascii="Times New Roman" w:hAnsi="Times New Roman" w:eastAsia="Times New Roman" w:cs="Times New Roman"/>
+          <w:noProof w:val="0"/>
+          <w:sz w:val="22"/>
+          <w:szCs w:val="22"/>
+          <w:lang w:val="en-GB"/>
+        </w:rPr>
+        <w:t xml:space="preserve"> </w:t>
+      </w:r>
+      <w:r>
+        <w:rPr>
+          <w:rFonts w:ascii="Times New Roman" w:hAnsi="Times New Roman" w:eastAsia="Times New Roman" w:cs="Times New Roman"/>
+          <w:noProof w:val="0"/>
+          <w:sz w:val="22"/>
+          <w:szCs w:val="22"/>
+          <w:lang w:val="en-GB"/>
+        </w:rPr>
+        <w:t>advanced</w:t>
+      </w:r>
+      <w:r>
+        <w:rPr>
+          <w:rFonts w:ascii="Times New Roman" w:hAnsi="Times New Roman" w:eastAsia="Times New Roman" w:cs="Times New Roman"/>
+          <w:noProof w:val="0"/>
+          <w:sz w:val="22"/>
+          <w:szCs w:val="22"/>
+          <w:lang w:val="en-GB"/>
+        </w:rPr>
+        <w:t xml:space="preserve"> smart home systems extend beyond basic monitoring and control by enabling the prediction and prevention of potential incidents in the home. </w:t>
+      </w:r>
+      <w:r>
+        <w:rPr>
+          <w:rFonts w:ascii="Times New Roman" w:hAnsi="Times New Roman" w:eastAsia="Times New Roman" w:cs="Times New Roman"/>
+          <w:noProof w:val="0"/>
+          <w:sz w:val="22"/>
+          <w:szCs w:val="22"/>
+          <w:lang w:val="en-GB"/>
+        </w:rPr>
+        <w:t xml:space="preserve">Their six-layer architecture consisting of smart devices and sensors, communication and gateway, intelligent management and decision-making, cloud computing, control, and security layers—closely aligns with the layered frameworks commonly applied in industrial </w:t>
+      </w:r>
+      <w:r>
+        <w:rPr>
+          <w:rFonts w:ascii="Times New Roman" w:hAnsi="Times New Roman" w:eastAsia="Times New Roman" w:cs="Times New Roman"/>
+          <w:noProof w:val="0"/>
+          <w:sz w:val="22"/>
+          <w:szCs w:val="22"/>
+          <w:lang w:val="en-GB"/>
+        </w:rPr>
+        <w:t>IIoT</w:t>
+      </w:r>
+      <w:r>
+        <w:rPr>
+          <w:rFonts w:ascii="Times New Roman" w:hAnsi="Times New Roman" w:eastAsia="Times New Roman" w:cs="Times New Roman"/>
+          <w:noProof w:val="0"/>
+          <w:sz w:val="22"/>
+          <w:szCs w:val="22"/>
+          <w:lang w:val="en-GB"/>
+        </w:rPr>
+        <w:t xml:space="preserve"> systems</w:t>
+      </w:r>
+      <w:r>
+        <w:rPr>
+          <w:rFonts w:ascii="Times New Roman" w:hAnsi="Times New Roman" w:eastAsia="Times New Roman" w:cs="Times New Roman"/>
+          <w:noProof w:val="0"/>
+          <w:sz w:val="22"/>
+          <w:szCs w:val="22"/>
+          <w:lang w:val="en-GB"/>
+        </w:rPr>
+        <w:t>.</w:t>
+      </w:r>
+      <w:r>
+        <w:rPr>
+          <w:rFonts w:ascii="Times New Roman" w:hAnsi="Times New Roman" w:eastAsia="Times New Roman" w:cs="Times New Roman"/>
+          <w:noProof w:val="0"/>
+          <w:sz w:val="22"/>
+          <w:szCs w:val="22"/>
+          <w:lang w:val="en-GB"/>
+        </w:rPr>
+        <w:t xml:space="preserve"> </w:t>
+      </w:r>
+      <w:r>
+        <w:rPr>
+          <w:rFonts w:ascii="Times New Roman" w:hAnsi="Times New Roman" w:eastAsia="Times New Roman" w:cs="Times New Roman"/>
+          <w:noProof w:val="0"/>
+          <w:sz w:val="22"/>
+          <w:szCs w:val="22"/>
+          <w:lang w:val="en-GB"/>
+        </w:rPr>
+        <w:t xml:space="preserve">CBI (2025) </w:t>
+      </w:r>
+      <w:r>
+        <w:rPr>
+          <w:rFonts w:ascii="Times New Roman" w:hAnsi="Times New Roman" w:eastAsia="Times New Roman" w:cs="Times New Roman"/>
+          <w:noProof w:val="0"/>
+          <w:sz w:val="22"/>
+          <w:szCs w:val="22"/>
+          <w:lang w:val="en-GB"/>
+        </w:rPr>
+        <w:t>identifies</w:t>
+      </w:r>
+      <w:r>
+        <w:rPr>
+          <w:rFonts w:ascii="Times New Roman" w:hAnsi="Times New Roman" w:eastAsia="Times New Roman" w:cs="Times New Roman"/>
+          <w:noProof w:val="0"/>
+          <w:sz w:val="22"/>
+          <w:szCs w:val="22"/>
+          <w:lang w:val="en-GB"/>
+        </w:rPr>
+        <w:t xml:space="preserve"> </w:t>
+      </w:r>
+      <w:r>
+        <w:rPr>
+          <w:rFonts w:ascii="Times New Roman" w:hAnsi="Times New Roman" w:eastAsia="Times New Roman" w:cs="Times New Roman"/>
+          <w:noProof w:val="0"/>
+          <w:sz w:val="22"/>
+          <w:szCs w:val="22"/>
+          <w:lang w:val="en-GB"/>
+        </w:rPr>
+        <w:t xml:space="preserve">Poland as one of the fastest-growing IoT markets in Europe, with a projected CAGR of 12.06% through 2029, </w:t>
+      </w:r>
+      <w:r>
+        <w:rPr>
+          <w:rFonts w:ascii="Times New Roman" w:hAnsi="Times New Roman" w:eastAsia="Times New Roman" w:cs="Times New Roman"/>
+          <w:noProof w:val="0"/>
+          <w:sz w:val="22"/>
+          <w:szCs w:val="22"/>
+          <w:lang w:val="en-GB"/>
+        </w:rPr>
+        <w:t>highlighting</w:t>
+      </w:r>
+      <w:r>
+        <w:rPr>
+          <w:rFonts w:ascii="Times New Roman" w:hAnsi="Times New Roman" w:eastAsia="Times New Roman" w:cs="Times New Roman"/>
+          <w:noProof w:val="0"/>
+          <w:sz w:val="22"/>
+          <w:szCs w:val="22"/>
+          <w:lang w:val="en-GB"/>
+        </w:rPr>
+        <w:t xml:space="preserve"> the regional relevance of IoT adoption trends to the deployment context of this project. </w:t>
+      </w:r>
+      <w:r>
+        <w:rPr>
+          <w:rFonts w:ascii="Times New Roman" w:hAnsi="Times New Roman" w:eastAsia="Times New Roman" w:cs="Times New Roman"/>
+          <w:noProof w:val="0"/>
+          <w:sz w:val="22"/>
+          <w:szCs w:val="22"/>
+          <w:lang w:val="en-GB"/>
+        </w:rPr>
+        <w:t>While</w:t>
+      </w:r>
+      <w:r>
+        <w:rPr>
+          <w:rFonts w:ascii="Times New Roman" w:hAnsi="Times New Roman" w:eastAsia="Times New Roman" w:cs="Times New Roman"/>
+          <w:noProof w:val="0"/>
+          <w:sz w:val="22"/>
+          <w:szCs w:val="22"/>
+          <w:lang w:val="en-GB"/>
+        </w:rPr>
+        <w:t xml:space="preserve"> enterprise </w:t>
+      </w:r>
+      <w:r>
+        <w:rPr>
+          <w:rFonts w:ascii="Times New Roman" w:hAnsi="Times New Roman" w:eastAsia="Times New Roman" w:cs="Times New Roman"/>
+          <w:noProof w:val="0"/>
+          <w:sz w:val="22"/>
+          <w:szCs w:val="22"/>
+          <w:lang w:val="en-GB"/>
+        </w:rPr>
+        <w:t>IIoT</w:t>
+      </w:r>
+      <w:r>
+        <w:rPr>
+          <w:rFonts w:ascii="Times New Roman" w:hAnsi="Times New Roman" w:eastAsia="Times New Roman" w:cs="Times New Roman"/>
+          <w:noProof w:val="0"/>
+          <w:sz w:val="22"/>
+          <w:szCs w:val="22"/>
+          <w:lang w:val="en-GB"/>
+        </w:rPr>
+        <w:t xml:space="preserve"> systems often demand significant infrastructure investment, this thesis implements the same architectural principles at a lower cost using a Raspberry Pi 4 and Home Assistant, showing that </w:t>
+      </w:r>
+      <w:r>
+        <w:rPr>
+          <w:rFonts w:ascii="Times New Roman" w:hAnsi="Times New Roman" w:eastAsia="Times New Roman" w:cs="Times New Roman"/>
+          <w:noProof w:val="0"/>
+          <w:sz w:val="22"/>
+          <w:szCs w:val="22"/>
+          <w:lang w:val="en-GB"/>
+        </w:rPr>
+        <w:t>IIoT</w:t>
+      </w:r>
+      <w:r>
+        <w:rPr>
+          <w:rFonts w:ascii="Times New Roman" w:hAnsi="Times New Roman" w:eastAsia="Times New Roman" w:cs="Times New Roman"/>
+          <w:noProof w:val="0"/>
+          <w:sz w:val="22"/>
+          <w:szCs w:val="22"/>
+          <w:lang w:val="en-GB"/>
+        </w:rPr>
+        <w:t xml:space="preserve"> design concepts can be reproduced affordably while </w:t>
+      </w:r>
+      <w:r>
+        <w:rPr>
+          <w:rFonts w:ascii="Times New Roman" w:hAnsi="Times New Roman" w:eastAsia="Times New Roman" w:cs="Times New Roman"/>
+          <w:noProof w:val="0"/>
+          <w:sz w:val="22"/>
+          <w:szCs w:val="22"/>
+          <w:lang w:val="en-GB"/>
+        </w:rPr>
+        <w:t>maintaining</w:t>
+      </w:r>
+      <w:r>
+        <w:rPr>
+          <w:rFonts w:ascii="Times New Roman" w:hAnsi="Times New Roman" w:eastAsia="Times New Roman" w:cs="Times New Roman"/>
+          <w:noProof w:val="0"/>
+          <w:sz w:val="22"/>
+          <w:szCs w:val="22"/>
+          <w:lang w:val="en-GB"/>
+        </w:rPr>
+        <w:t xml:space="preserve"> core functionality.</w:t>
+      </w:r>
+    </w:p>
+    <w:p>
+      <w:pPr>
+        <w:pStyle w:val="Normal"/>
+        <w:spacing w:before="240" w:beforeAutospacing="off" w:after="240" w:afterAutospacing="off"/>
+        <w:jc w:val="left"/>
+        <w:rPr>
+          <w:rFonts w:ascii="Times New Roman" w:hAnsi="Times New Roman" w:eastAsia="Times New Roman" w:cs="Times New Roman"/>
+          <w:noProof w:val="0"/>
+          <w:sz w:val="22"/>
+          <w:szCs w:val="22"/>
+          <w:lang w:val="en-GB"/>
+        </w:rPr>
+      </w:pPr>
+    </w:p>
+    <w:p>
+      <w:pPr>
+        <w:pStyle w:val="Normal"/>
+        <w:spacing w:before="240" w:beforeAutospacing="off" w:after="240" w:afterAutospacing="off"/>
+        <w:jc w:val="left"/>
+        <w:rPr>
+          <w:rFonts w:ascii="Times New Roman" w:hAnsi="Times New Roman" w:eastAsia="Times New Roman" w:cs="Times New Roman"/>
+          <w:noProof w:val="0"/>
+          <w:sz w:val="22"/>
+          <w:szCs w:val="22"/>
+          <w:lang w:val="en-GB"/>
+        </w:rPr>
+      </w:pPr>
+    </w:p>
+    <w:p>
+      <w:pPr>
+        <w:pStyle w:val="Normal"/>
+        <w:spacing w:before="240" w:beforeAutospacing="off" w:after="240" w:afterAutospacing="off"/>
+        <w:jc w:val="left"/>
+        <w:rPr>
+          <w:rFonts w:ascii="Aptos" w:hAnsi="Aptos" w:eastAsia="Aptos" w:cs="Aptos"/>
+          <w:noProof w:val="0"/>
+          <w:sz w:val="24"/>
+          <w:szCs w:val="24"/>
+          <w:lang w:val="en-GB"/>
+        </w:rPr>
+      </w:pPr>
+    </w:p>
+    <w:p>
+      <w:pPr>
+        <w:spacing w:before="240" w:beforeAutospacing="off" w:after="240" w:afterAutospacing="off"/>
+        <w:jc w:val="left"/>
+        <w:rPr>
+          <w:rFonts w:ascii="Aptos" w:hAnsi="Aptos" w:eastAsia="Aptos" w:cs="Aptos"/>
+          <w:b w:val="1"/>
+          <w:bCs w:val="1"/>
+          <w:noProof w:val="0"/>
+          <w:color w:val="auto"/>
+          <w:sz w:val="36"/>
+          <w:szCs w:val="36"/>
+          <w:lang w:val="en-GB"/>
+        </w:rPr>
+      </w:pPr>
+      <w:r>
+        <w:rPr>
+          <w:rFonts w:ascii="Aptos" w:hAnsi="Aptos" w:eastAsia="Aptos" w:cs="Aptos"/>
+          <w:b w:val="1"/>
+          <w:bCs w:val="1"/>
+          <w:noProof w:val="0"/>
+          <w:color w:val="auto"/>
+          <w:sz w:val="36"/>
+          <w:szCs w:val="36"/>
+          <w:lang w:val="en-GB"/>
+        </w:rPr>
+        <w:t xml:space="preserve">Section 2.5 — Sensor Technologies: DHT22, PIR, Relay </w:t>
+      </w:r>
     </w:p>
     <w:p>
       <w:pPr>
@@ -5836,7 +4962,7 @@
       </w:pPr>
       <w:r>
         <w:rPr>
-          <w:rFonts w:ascii="Times New Roman" w:hAnsi="Times New Roman" w:eastAsia="Times New Roman" w:cs="Times New Roman"/>
+          <w:rFonts w:ascii="Aptos" w:hAnsi="Aptos" w:eastAsia="Aptos" w:cs="Aptos"/>
           <w:b w:val="1"/>
           <w:bCs w:val="1"/>
           <w:noProof w:val="0"/>
@@ -5844,55 +4970,7 @@
           <w:szCs w:val="28"/>
           <w:lang w:val="en-GB"/>
         </w:rPr>
-        <w:t>2.4 IIoT Trends and Relevance</w:t>
-      </w:r>
-    </w:p>
-    <w:p>
-      <w:pPr>
-        <w:spacing w:before="240" w:beforeAutospacing="off" w:after="240" w:afterAutospacing="off"/>
-        <w:jc w:val="left"/>
-      </w:pPr>
-      <w:r>
-        <w:rPr>
-          <w:rFonts w:ascii="Times New Roman" w:hAnsi="Times New Roman" w:eastAsia="Times New Roman" w:cs="Times New Roman"/>
-          <w:noProof w:val="0"/>
-          <w:sz w:val="22"/>
-          <w:szCs w:val="22"/>
-          <w:lang w:val="en-GB"/>
-        </w:rPr>
-        <w:t>The Industrial Internet of Things represents one of the most significant technological developments of the current decade, transforming how industries monitor, control, and optimise physical processes through interconnected sensor networks and real-time data analytics. According to IMARC Group (2025), the global IIoT market reached USD 325.7 billion in 2025 and is projected to grow to USD 944.8 billion by 2034, at a compound annual growth rate of 12.18%. The primary drivers of this expansion include the proliferation of smart city initiatives, advances in edge computing, and the rapid deployment of 5G connectivity. The Centre for the Promotion of Imports (CBI, 2025) reports that Europe's broader IoT market is expected to grow from €179 billion in 2025 to €258 billion by 2029, with Europe holding the largest regional IIoT share globally due to its robust manufacturing base and strong government investment in digital infrastructure. Germany alone is projected to have 84% of its manufacturers investing approximately EUR 10 billion annually in smart manufacturing technologies by 2025 (IMARC, 2025).</w:t>
-      </w:r>
-    </w:p>
-    <w:p>
-      <w:pPr>
-        <w:spacing w:before="240" w:beforeAutospacing="off" w:after="240" w:afterAutospacing="off"/>
-        <w:jc w:val="left"/>
-      </w:pPr>
-      <w:r>
-        <w:rPr>
-          <w:rFonts w:ascii="Times New Roman" w:hAnsi="Times New Roman" w:eastAsia="Times New Roman" w:cs="Times New Roman"/>
-          <w:noProof w:val="0"/>
-          <w:sz w:val="22"/>
-          <w:szCs w:val="22"/>
-          <w:lang w:val="en-GB"/>
-        </w:rPr>
-        <w:t>A core principle of IIoT that has direct relevance to residential smart home applications is the integration of distributed sensor networks with real-time data processing and automated actuation. Bagdadee et al. (2025) demonstrated this principle at the household scale, showing that an IoT-based hybrid energy system — coordinating solar panels, wind turbines, and battery storage through Zigbee, Z-Wave, and Wi-Fi communication protocols — achieved system efficiency of 80% and reduced energy costs by 61% compared to conventional grid-connected systems. CO₂ emissions were simultaneously reduced by over 61%. The authors attribute these gains to real-time monitoring and adaptive energy management enabled by IoT sensors and controllers, confirming that the architectural logic of IIoT — distributed sensing, centralised decision-making, and automated response — produces measurable efficiency improvements even at the residential level. The Mordor Intelligence Europe Smart Homes Market Report (2026) contextualises this within market trends, projecting the European smart homes market to grow from USD 23.14 billion in 2025 to USD 32.12 billion by 2031, driven substantially by energy performance mandates, dynamic electricity tariffs, and demand for automated load-shifting capabilities.</w:t>
-      </w:r>
-    </w:p>
-    <w:p>
-      <w:pPr>
-        <w:spacing w:before="240" w:beforeAutospacing="off" w:after="240" w:afterAutospacing="off"/>
-        <w:jc w:val="left"/>
-      </w:pPr>
-      <w:r>
-        <w:rPr>
-          <w:rFonts w:ascii="Times New Roman" w:hAnsi="Times New Roman" w:eastAsia="Times New Roman" w:cs="Times New Roman"/>
-          <w:noProof w:val="0"/>
-          <w:sz w:val="22"/>
-          <w:szCs w:val="22"/>
-          <w:lang w:val="en-GB"/>
-        </w:rPr>
-        <w:t>Beyond energy management, the convergence of AI and IoT — increasingly referred to as AIoT — introduces predictive and adaptive capabilities that extend smart home functionality beyond reactive automation. Ezugwu et al. (2025) note that intelligent smart home automation systems go beyond mere monitoring and control, possessing the capability to predict and prevent potential incidents within the home environment. Their proposed six-layer architecture — encompassing a smart device and sensor layer, a communication and gateway layer, an intelligent management and decision layer, a cloud computing layer, a control layer, and a security layer — directly mirrors the layered architectures developed for industrial IIoT deployments. The CBI (2025) highlights Poland as one of the fastest-growing IoT markets in Europe, with a projected CAGR of 12.06% through 2029, underscoring the regional relevance of IoT adoption trends to the deployment context of this project. While enterprise-grade IIoT systems typically require significant infrastructure investment, the system developed in this thesis applies these same architectural principles at an accessible scale using a Raspberry Pi 4 and Home Assistant, demonstrating that IIoT design logic can be replicated affordably without sacrificing core functionality.</w:t>
+        <w:t>2.5 Sensor Technologies: DHT22, PIR, and Relay Module</w:t>
       </w:r>
     </w:p>
     <w:p>
@@ -5900,14 +4978,384 @@
         <w:pStyle w:val="Normal"/>
         <w:spacing w:before="240" w:beforeAutospacing="off" w:after="240" w:afterAutospacing="off"/>
         <w:jc w:val="left"/>
-        <w:rPr>
-          <w:rFonts w:ascii="Times New Roman" w:hAnsi="Times New Roman" w:eastAsia="Times New Roman" w:cs="Times New Roman"/>
-          <w:noProof w:val="0"/>
-          <w:sz w:val="22"/>
-          <w:szCs w:val="22"/>
-          <w:lang w:val="en-GB"/>
-        </w:rPr>
-      </w:pPr>
+      </w:pPr>
+      <w:r>
+        <w:rPr>
+          <w:rFonts w:ascii="Aptos" w:hAnsi="Aptos" w:eastAsia="Aptos" w:cs="Aptos"/>
+          <w:noProof w:val="0"/>
+          <w:sz w:val="24"/>
+          <w:szCs w:val="24"/>
+          <w:lang w:val="en-GB"/>
+        </w:rPr>
+        <w:t>Sensors form the foundation of IoT systems by converting physical environmental conditions into digital data that can be processed, recorded, and used for decision-making. Ezugwu et al. (2025) define</w:t>
+      </w:r>
+      <w:r>
+        <w:rPr>
+          <w:rFonts w:ascii="Aptos" w:hAnsi="Aptos" w:eastAsia="Aptos" w:cs="Aptos"/>
+          <w:noProof w:val="0"/>
+          <w:sz w:val="24"/>
+          <w:szCs w:val="24"/>
+          <w:lang w:val="en-GB"/>
+        </w:rPr>
+        <w:t>s</w:t>
+      </w:r>
+      <w:r>
+        <w:rPr>
+          <w:rFonts w:ascii="Aptos" w:hAnsi="Aptos" w:eastAsia="Aptos" w:cs="Aptos"/>
+          <w:noProof w:val="0"/>
+          <w:sz w:val="24"/>
+          <w:szCs w:val="24"/>
+          <w:lang w:val="en-GB"/>
+        </w:rPr>
+        <w:t xml:space="preserve"> a</w:t>
+      </w:r>
+      <w:r>
+        <w:rPr>
+          <w:rFonts w:ascii="Aptos" w:hAnsi="Aptos" w:eastAsia="Aptos" w:cs="Aptos"/>
+          <w:noProof w:val="0"/>
+          <w:sz w:val="24"/>
+          <w:szCs w:val="24"/>
+          <w:lang w:val="en-GB"/>
+        </w:rPr>
+        <w:t xml:space="preserve"> sensor </w:t>
+      </w:r>
+      <w:r>
+        <w:rPr>
+          <w:rFonts w:ascii="Aptos" w:hAnsi="Aptos" w:eastAsia="Aptos" w:cs="Aptos"/>
+          <w:noProof w:val="0"/>
+          <w:sz w:val="24"/>
+          <w:szCs w:val="24"/>
+          <w:lang w:val="en-GB"/>
+        </w:rPr>
+        <w:t>as</w:t>
+      </w:r>
+      <w:r>
+        <w:rPr>
+          <w:rFonts w:ascii="Aptos" w:hAnsi="Aptos" w:eastAsia="Aptos" w:cs="Aptos"/>
+          <w:noProof w:val="0"/>
+          <w:sz w:val="24"/>
+          <w:szCs w:val="24"/>
+          <w:lang w:val="en-GB"/>
+        </w:rPr>
+        <w:t xml:space="preserve"> a device that detects certain external factors in the environment and responds accordingly, with sensor technology forming the foundation of smart home automation systems. </w:t>
+      </w:r>
+      <w:r>
+        <w:rPr>
+          <w:rFonts w:ascii="Aptos" w:hAnsi="Aptos" w:eastAsia="Aptos" w:cs="Aptos"/>
+          <w:noProof w:val="0"/>
+          <w:sz w:val="24"/>
+          <w:szCs w:val="24"/>
+          <w:lang w:val="en-GB"/>
+        </w:rPr>
+        <w:t xml:space="preserve">Environmental sensors such as those for temperature, humidity, motion, smoke, and gas detection are considered the primary data-gathering layer in IoT systems and are typically installed on surfaces like walls, doors, and furniture to enable continuous monitoring of home environments. </w:t>
+      </w:r>
+      <w:r>
+        <w:rPr>
+          <w:rFonts w:ascii="Aptos" w:hAnsi="Aptos" w:eastAsia="Aptos" w:cs="Aptos"/>
+          <w:noProof w:val="0"/>
+          <w:sz w:val="24"/>
+          <w:szCs w:val="24"/>
+          <w:lang w:val="en-GB"/>
+        </w:rPr>
+        <w:t>In this thesis, the sensing and actuation functionality is implemented using three core components: the DHT22 temperature and humidity sensor, the Passive Infrared (PIR) motion sensor, and an electromagnetic relay module.</w:t>
+      </w:r>
+    </w:p>
+    <w:p>
+      <w:pPr>
+        <w:pStyle w:val="Normal"/>
+        <w:suppressLineNumbers w:val="0"/>
+        <w:bidi w:val="0"/>
+        <w:spacing w:before="240" w:beforeAutospacing="off" w:after="240" w:afterAutospacing="off" w:line="279" w:lineRule="auto"/>
+        <w:ind w:left="0" w:right="0"/>
+        <w:jc w:val="left"/>
+        <w:rPr>
+          <w:rFonts w:ascii="Aptos" w:hAnsi="Aptos" w:eastAsia="Aptos" w:cs="Aptos"/>
+          <w:noProof w:val="0"/>
+          <w:sz w:val="24"/>
+          <w:szCs w:val="24"/>
+          <w:lang w:val="en-GB"/>
+        </w:rPr>
+      </w:pPr>
+      <w:r>
+        <w:rPr>
+          <w:rFonts w:ascii="Aptos" w:hAnsi="Aptos" w:eastAsia="Aptos" w:cs="Aptos"/>
+          <w:noProof w:val="0"/>
+          <w:sz w:val="24"/>
+          <w:szCs w:val="24"/>
+          <w:lang w:val="en-GB"/>
+        </w:rPr>
+        <w:t xml:space="preserve">The DHT22 is a digital environmental sensor that integrates a thermistor for temperature </w:t>
+      </w:r>
+      <w:r>
+        <w:rPr>
+          <w:rFonts w:ascii="Aptos" w:hAnsi="Aptos" w:eastAsia="Aptos" w:cs="Aptos"/>
+          <w:noProof w:val="0"/>
+          <w:sz w:val="24"/>
+          <w:szCs w:val="24"/>
+          <w:lang w:val="en-GB"/>
+        </w:rPr>
+        <w:t>measuremnt</w:t>
+      </w:r>
+      <w:r>
+        <w:rPr>
+          <w:rFonts w:ascii="Aptos" w:hAnsi="Aptos" w:eastAsia="Aptos" w:cs="Aptos"/>
+          <w:noProof w:val="0"/>
+          <w:sz w:val="24"/>
+          <w:szCs w:val="24"/>
+          <w:lang w:val="en-GB"/>
+        </w:rPr>
+        <w:t xml:space="preserve"> and a capacitive </w:t>
+      </w:r>
+      <w:r>
+        <w:rPr>
+          <w:rFonts w:ascii="Aptos" w:hAnsi="Aptos" w:eastAsia="Aptos" w:cs="Aptos"/>
+          <w:noProof w:val="0"/>
+          <w:sz w:val="24"/>
+          <w:szCs w:val="24"/>
+          <w:lang w:val="en-GB"/>
+        </w:rPr>
+        <w:t>componet</w:t>
+      </w:r>
+      <w:r>
+        <w:rPr>
+          <w:rFonts w:ascii="Aptos" w:hAnsi="Aptos" w:eastAsia="Aptos" w:cs="Aptos"/>
+          <w:noProof w:val="0"/>
+          <w:sz w:val="24"/>
+          <w:szCs w:val="24"/>
+          <w:lang w:val="en-GB"/>
+        </w:rPr>
+        <w:t xml:space="preserve"> for relative humidity detection.</w:t>
+      </w:r>
+      <w:r>
+        <w:rPr>
+          <w:rFonts w:ascii="Aptos" w:hAnsi="Aptos" w:eastAsia="Aptos" w:cs="Aptos"/>
+          <w:noProof w:val="0"/>
+          <w:sz w:val="24"/>
+          <w:szCs w:val="24"/>
+          <w:lang w:val="en-GB"/>
+        </w:rPr>
+        <w:t xml:space="preserve"> </w:t>
+      </w:r>
+      <w:r>
+        <w:rPr>
+          <w:rFonts w:ascii="Aptos" w:hAnsi="Aptos" w:eastAsia="Aptos" w:cs="Aptos"/>
+          <w:noProof w:val="0"/>
+          <w:sz w:val="24"/>
+          <w:szCs w:val="24"/>
+          <w:lang w:val="en-GB"/>
+        </w:rPr>
+        <w:t xml:space="preserve">Khan et al. (2024) deployed DHT sensors on a Raspberry Pi as part of a predictive energy optimisation system, collecting indoor temperature and humidity data at hourly intervals to train deep learning models including Long Short-Term Memory (LSTM), Recurrent Neural Networks (RNN), and Gated Recurrent Unit (GRU) </w:t>
+      </w:r>
+      <w:r>
+        <w:rPr>
+          <w:rFonts w:ascii="Aptos" w:hAnsi="Aptos" w:eastAsia="Aptos" w:cs="Aptos"/>
+          <w:noProof w:val="0"/>
+          <w:sz w:val="24"/>
+          <w:szCs w:val="24"/>
+          <w:lang w:val="en-GB"/>
+        </w:rPr>
+        <w:t>architectures</w:t>
+      </w:r>
+      <w:r>
+        <w:rPr>
+          <w:rFonts w:ascii="Aptos" w:hAnsi="Aptos" w:eastAsia="Aptos" w:cs="Aptos"/>
+          <w:noProof w:val="0"/>
+          <w:sz w:val="24"/>
+          <w:szCs w:val="24"/>
+          <w:lang w:val="en-GB"/>
+        </w:rPr>
+        <w:t xml:space="preserve">, </w:t>
+      </w:r>
+      <w:r>
+        <w:rPr>
+          <w:rFonts w:ascii="Aptos" w:hAnsi="Aptos" w:eastAsia="Aptos" w:cs="Aptos"/>
+          <w:noProof w:val="0"/>
+          <w:sz w:val="24"/>
+          <w:szCs w:val="24"/>
+          <w:lang w:val="en-GB"/>
+        </w:rPr>
+        <w:t>capable of predicting environmental conditions and energy consumption one time-step</w:t>
+      </w:r>
+      <w:r>
+        <w:rPr>
+          <w:rFonts w:ascii="Aptos" w:hAnsi="Aptos" w:eastAsia="Aptos" w:cs="Aptos"/>
+          <w:noProof w:val="0"/>
+          <w:sz w:val="24"/>
+          <w:szCs w:val="24"/>
+          <w:lang w:val="en-GB"/>
+        </w:rPr>
+        <w:t xml:space="preserve"> in advance</w:t>
+      </w:r>
+      <w:r>
+        <w:rPr>
+          <w:rFonts w:ascii="Aptos" w:hAnsi="Aptos" w:eastAsia="Aptos" w:cs="Aptos"/>
+          <w:noProof w:val="0"/>
+          <w:sz w:val="24"/>
+          <w:szCs w:val="24"/>
+          <w:lang w:val="en-GB"/>
+        </w:rPr>
+        <w:t xml:space="preserve">. </w:t>
+      </w:r>
+      <w:r>
+        <w:rPr>
+          <w:rFonts w:ascii="Aptos" w:hAnsi="Aptos" w:eastAsia="Aptos" w:cs="Aptos"/>
+          <w:noProof w:val="0"/>
+          <w:sz w:val="24"/>
+          <w:szCs w:val="24"/>
+          <w:lang w:val="en-GB"/>
+        </w:rPr>
+        <w:t xml:space="preserve">One </w:t>
+      </w:r>
+      <w:r>
+        <w:rPr>
+          <w:rFonts w:ascii="Aptos" w:hAnsi="Aptos" w:eastAsia="Aptos" w:cs="Aptos"/>
+          <w:noProof w:val="0"/>
+          <w:sz w:val="24"/>
+          <w:szCs w:val="24"/>
+          <w:lang w:val="en-GB"/>
+        </w:rPr>
+        <w:t>practical</w:t>
+      </w:r>
+      <w:r>
+        <w:rPr>
+          <w:rFonts w:ascii="Aptos" w:hAnsi="Aptos" w:eastAsia="Aptos" w:cs="Aptos"/>
+          <w:noProof w:val="0"/>
+          <w:sz w:val="24"/>
+          <w:szCs w:val="24"/>
+          <w:lang w:val="en-GB"/>
+        </w:rPr>
+        <w:t xml:space="preserve"> limitation </w:t>
+      </w:r>
+      <w:r>
+        <w:rPr>
+          <w:rFonts w:ascii="Aptos" w:hAnsi="Aptos" w:eastAsia="Aptos" w:cs="Aptos"/>
+          <w:noProof w:val="0"/>
+          <w:sz w:val="24"/>
+          <w:szCs w:val="24"/>
+          <w:lang w:val="en-GB"/>
+        </w:rPr>
+        <w:t>identified</w:t>
+      </w:r>
+      <w:r>
+        <w:rPr>
+          <w:rFonts w:ascii="Aptos" w:hAnsi="Aptos" w:eastAsia="Aptos" w:cs="Aptos"/>
+          <w:noProof w:val="0"/>
+          <w:sz w:val="24"/>
+          <w:szCs w:val="24"/>
+          <w:lang w:val="en-GB"/>
+        </w:rPr>
+        <w:t xml:space="preserve"> is that the sensing process can</w:t>
+      </w:r>
+      <w:r>
+        <w:rPr>
+          <w:rFonts w:ascii="Aptos" w:hAnsi="Aptos" w:eastAsia="Aptos" w:cs="Aptos"/>
+          <w:noProof w:val="0"/>
+          <w:sz w:val="24"/>
+          <w:szCs w:val="24"/>
+          <w:lang w:val="en-GB"/>
+        </w:rPr>
+        <w:t xml:space="preserve"> occasionally</w:t>
+      </w:r>
+      <w:r>
+        <w:rPr>
+          <w:rFonts w:ascii="Aptos" w:hAnsi="Aptos" w:eastAsia="Aptos" w:cs="Aptos"/>
+          <w:noProof w:val="0"/>
+          <w:sz w:val="24"/>
+          <w:szCs w:val="24"/>
+          <w:lang w:val="en-GB"/>
+        </w:rPr>
+        <w:t xml:space="preserve"> generate null values due to sensor calibration and saturation, requiring</w:t>
+      </w:r>
+      <w:r>
+        <w:rPr>
+          <w:rFonts w:ascii="Aptos" w:hAnsi="Aptos" w:eastAsia="Aptos" w:cs="Aptos"/>
+          <w:noProof w:val="0"/>
+          <w:sz w:val="24"/>
+          <w:szCs w:val="24"/>
+          <w:lang w:val="en-GB"/>
+        </w:rPr>
+        <w:t xml:space="preserve"> </w:t>
+      </w:r>
+      <w:r>
+        <w:rPr>
+          <w:rFonts w:ascii="Aptos" w:hAnsi="Aptos" w:eastAsia="Aptos" w:cs="Aptos"/>
+          <w:noProof w:val="0"/>
+          <w:sz w:val="24"/>
+          <w:szCs w:val="24"/>
+          <w:lang w:val="en-GB"/>
+        </w:rPr>
+        <w:t xml:space="preserve">data cleaning </w:t>
+      </w:r>
+      <w:r>
+        <w:rPr>
+          <w:rFonts w:ascii="Aptos" w:hAnsi="Aptos" w:eastAsia="Aptos" w:cs="Aptos"/>
+          <w:noProof w:val="0"/>
+          <w:sz w:val="24"/>
+          <w:szCs w:val="24"/>
+          <w:lang w:val="en-GB"/>
+        </w:rPr>
+        <w:t>prior to</w:t>
+      </w:r>
+      <w:r>
+        <w:rPr>
+          <w:rFonts w:ascii="Aptos" w:hAnsi="Aptos" w:eastAsia="Aptos" w:cs="Aptos"/>
+          <w:noProof w:val="0"/>
+          <w:sz w:val="24"/>
+          <w:szCs w:val="24"/>
+          <w:lang w:val="en-GB"/>
+        </w:rPr>
+        <w:t xml:space="preserve"> model training.</w:t>
+      </w:r>
+      <w:r>
+        <w:rPr>
+          <w:rFonts w:ascii="Aptos" w:hAnsi="Aptos" w:eastAsia="Aptos" w:cs="Aptos"/>
+          <w:noProof w:val="0"/>
+          <w:sz w:val="24"/>
+          <w:szCs w:val="24"/>
+          <w:lang w:val="en-GB"/>
+        </w:rPr>
+        <w:t xml:space="preserve"> </w:t>
+      </w:r>
+      <w:r>
+        <w:rPr>
+          <w:rFonts w:ascii="Aptos" w:hAnsi="Aptos" w:eastAsia="Aptos" w:cs="Aptos"/>
+          <w:noProof w:val="0"/>
+          <w:sz w:val="24"/>
+          <w:szCs w:val="24"/>
+          <w:lang w:val="en-GB"/>
+        </w:rPr>
+        <w:t xml:space="preserve">Energy cost savings of 35.98% to 38.22% were achieved across different pricing policies, </w:t>
+      </w:r>
+      <w:r>
+        <w:rPr>
+          <w:rFonts w:ascii="Aptos" w:hAnsi="Aptos" w:eastAsia="Aptos" w:cs="Aptos"/>
+          <w:noProof w:val="0"/>
+          <w:sz w:val="24"/>
+          <w:szCs w:val="24"/>
+          <w:lang w:val="en-GB"/>
+        </w:rPr>
+        <w:t>demonstrating</w:t>
+      </w:r>
+      <w:r>
+        <w:rPr>
+          <w:rFonts w:ascii="Aptos" w:hAnsi="Aptos" w:eastAsia="Aptos" w:cs="Aptos"/>
+          <w:noProof w:val="0"/>
+          <w:sz w:val="24"/>
+          <w:szCs w:val="24"/>
+          <w:lang w:val="en-GB"/>
+        </w:rPr>
+        <w:t xml:space="preserve"> how continuous environmental sensing supports proactive and efficient home energy management.</w:t>
+      </w:r>
+      <w:r>
+        <w:rPr>
+          <w:rFonts w:ascii="Aptos" w:hAnsi="Aptos" w:eastAsia="Aptos" w:cs="Aptos"/>
+          <w:noProof w:val="0"/>
+          <w:sz w:val="24"/>
+          <w:szCs w:val="24"/>
+          <w:lang w:val="en-GB"/>
+        </w:rPr>
+        <w:t xml:space="preserve"> </w:t>
+      </w:r>
     </w:p>
     <w:p>
       <w:pPr>
@@ -5922,197 +5370,326 @@
           <w:lang w:val="en-GB"/>
         </w:rPr>
       </w:pPr>
-    </w:p>
-    <w:p>
-      <w:pPr>
+      <w:r>
+        <w:rPr>
+          <w:rFonts w:ascii="Aptos" w:hAnsi="Aptos" w:eastAsia="Aptos" w:cs="Aptos"/>
+          <w:noProof w:val="0"/>
+          <w:sz w:val="24"/>
+          <w:szCs w:val="24"/>
+          <w:lang w:val="en-GB"/>
+        </w:rPr>
+        <w:t>The Passive Infrared (PIR) sensor detects motion by measuring changes in infrared radiation emitted by warm bodies within its detection range</w:t>
+      </w:r>
+      <w:r>
+        <w:rPr>
+          <w:rFonts w:ascii="Aptos" w:hAnsi="Aptos" w:eastAsia="Aptos" w:cs="Aptos"/>
+          <w:noProof w:val="0"/>
+          <w:sz w:val="24"/>
+          <w:szCs w:val="24"/>
+          <w:lang w:val="en-GB"/>
+        </w:rPr>
+        <w:t xml:space="preserve">. </w:t>
+      </w:r>
+      <w:r>
+        <w:rPr>
+          <w:rFonts w:ascii="Aptos" w:hAnsi="Aptos" w:eastAsia="Aptos" w:cs="Aptos"/>
+          <w:noProof w:val="0"/>
+          <w:sz w:val="24"/>
+          <w:szCs w:val="24"/>
+          <w:lang w:val="en-GB"/>
+        </w:rPr>
+        <w:t>Gagote et al. (2026) developed a PIR-based automatic lighting system designed to activate an LED circui</w:t>
+      </w:r>
+      <w:r>
+        <w:rPr>
+          <w:rFonts w:ascii="Aptos" w:hAnsi="Aptos" w:eastAsia="Aptos" w:cs="Aptos"/>
+          <w:noProof w:val="0"/>
+          <w:sz w:val="24"/>
+          <w:szCs w:val="24"/>
+          <w:lang w:val="en-GB"/>
+        </w:rPr>
+        <w:t xml:space="preserve">t upon </w:t>
+      </w:r>
+      <w:r>
+        <w:rPr>
+          <w:rFonts w:ascii="Aptos" w:hAnsi="Aptos" w:eastAsia="Aptos" w:cs="Aptos"/>
+          <w:noProof w:val="0"/>
+          <w:sz w:val="24"/>
+          <w:szCs w:val="24"/>
+          <w:lang w:val="en-GB"/>
+        </w:rPr>
+        <w:t>detection</w:t>
+      </w:r>
+      <w:r>
+        <w:rPr>
+          <w:rFonts w:ascii="Aptos" w:hAnsi="Aptos" w:eastAsia="Aptos" w:cs="Aptos"/>
+          <w:noProof w:val="0"/>
+          <w:sz w:val="24"/>
+          <w:szCs w:val="24"/>
+          <w:lang w:val="en-GB"/>
+        </w:rPr>
+        <w:t xml:space="preserve"> of</w:t>
+      </w:r>
+      <w:r>
+        <w:rPr>
+          <w:rFonts w:ascii="Aptos" w:hAnsi="Aptos" w:eastAsia="Aptos" w:cs="Aptos"/>
+          <w:noProof w:val="0"/>
+          <w:sz w:val="24"/>
+          <w:szCs w:val="24"/>
+          <w:lang w:val="en-GB"/>
+        </w:rPr>
+        <w:t xml:space="preserve"> </w:t>
+      </w:r>
+      <w:r>
+        <w:rPr>
+          <w:rFonts w:ascii="Aptos" w:hAnsi="Aptos" w:eastAsia="Aptos" w:cs="Aptos"/>
+          <w:noProof w:val="0"/>
+          <w:sz w:val="24"/>
+          <w:szCs w:val="24"/>
+          <w:lang w:val="en-GB"/>
+        </w:rPr>
+        <w:t>motion</w:t>
+      </w:r>
+      <w:r>
+        <w:rPr>
+          <w:rFonts w:ascii="Aptos" w:hAnsi="Aptos" w:eastAsia="Aptos" w:cs="Aptos"/>
+          <w:noProof w:val="0"/>
+          <w:sz w:val="24"/>
+          <w:szCs w:val="24"/>
+          <w:lang w:val="en-GB"/>
+        </w:rPr>
+        <w:t xml:space="preserve">, </w:t>
+      </w:r>
+      <w:r>
+        <w:rPr>
+          <w:rFonts w:ascii="Aptos" w:hAnsi="Aptos" w:eastAsia="Aptos" w:cs="Aptos"/>
+          <w:noProof w:val="0"/>
+          <w:sz w:val="24"/>
+          <w:szCs w:val="24"/>
+          <w:lang w:val="en-GB"/>
+        </w:rPr>
+        <w:t>demonstrating</w:t>
+      </w:r>
+      <w:r>
+        <w:rPr>
+          <w:rFonts w:ascii="Aptos" w:hAnsi="Aptos" w:eastAsia="Aptos" w:cs="Aptos"/>
+          <w:noProof w:val="0"/>
+          <w:sz w:val="24"/>
+          <w:szCs w:val="24"/>
+          <w:lang w:val="en-GB"/>
+        </w:rPr>
+        <w:t xml:space="preserve"> </w:t>
+      </w:r>
+      <w:r>
+        <w:rPr>
+          <w:rFonts w:ascii="Aptos" w:hAnsi="Aptos" w:eastAsia="Aptos" w:cs="Aptos"/>
+          <w:noProof w:val="0"/>
+          <w:sz w:val="24"/>
+          <w:szCs w:val="24"/>
+          <w:lang w:val="en-GB"/>
+        </w:rPr>
+        <w:t>consistent</w:t>
+      </w:r>
+      <w:r>
+        <w:rPr>
+          <w:rFonts w:ascii="Aptos" w:hAnsi="Aptos" w:eastAsia="Aptos" w:cs="Aptos"/>
+          <w:noProof w:val="0"/>
+          <w:sz w:val="24"/>
+          <w:szCs w:val="24"/>
+          <w:lang w:val="en-GB"/>
+        </w:rPr>
+        <w:t xml:space="preserve"> indoor operation with minimal delay.</w:t>
+      </w:r>
+      <w:r>
+        <w:rPr>
+          <w:rFonts w:ascii="Aptos" w:hAnsi="Aptos" w:eastAsia="Aptos" w:cs="Aptos"/>
+          <w:noProof w:val="0"/>
+          <w:sz w:val="24"/>
+          <w:szCs w:val="24"/>
+          <w:lang w:val="en-GB"/>
+        </w:rPr>
+        <w:t xml:space="preserve"> </w:t>
+      </w:r>
+      <w:r>
+        <w:rPr>
+          <w:rFonts w:ascii="Aptos" w:hAnsi="Aptos" w:eastAsia="Aptos" w:cs="Aptos"/>
+          <w:noProof w:val="0"/>
+          <w:sz w:val="24"/>
+          <w:szCs w:val="24"/>
+          <w:lang w:val="en-GB"/>
+        </w:rPr>
+        <w:t>Although</w:t>
+      </w:r>
+      <w:r>
+        <w:rPr>
+          <w:rFonts w:ascii="Aptos" w:hAnsi="Aptos" w:eastAsia="Aptos" w:cs="Aptos"/>
+          <w:noProof w:val="0"/>
+          <w:sz w:val="24"/>
+          <w:szCs w:val="24"/>
+          <w:lang w:val="en-GB"/>
+        </w:rPr>
+        <w:t xml:space="preserve"> limitations such as sensitivity to temperature fluctuations and a limited detection range, t</w:t>
+      </w:r>
+      <w:r>
+        <w:rPr>
+          <w:rFonts w:ascii="Aptos" w:hAnsi="Aptos" w:eastAsia="Aptos" w:cs="Aptos"/>
+          <w:noProof w:val="0"/>
+          <w:sz w:val="24"/>
+          <w:szCs w:val="24"/>
+          <w:lang w:val="en-GB"/>
+        </w:rPr>
+        <w:t xml:space="preserve">he study confirms that PIR sensors are </w:t>
+      </w:r>
+      <w:r>
+        <w:rPr>
+          <w:rFonts w:ascii="Aptos" w:hAnsi="Aptos" w:eastAsia="Aptos" w:cs="Aptos"/>
+          <w:noProof w:val="0"/>
+          <w:sz w:val="24"/>
+          <w:szCs w:val="24"/>
+          <w:lang w:val="en-GB"/>
+        </w:rPr>
+        <w:t>viable</w:t>
+      </w:r>
+      <w:r>
+        <w:rPr>
+          <w:rFonts w:ascii="Aptos" w:hAnsi="Aptos" w:eastAsia="Aptos" w:cs="Aptos"/>
+          <w:noProof w:val="0"/>
+          <w:sz w:val="24"/>
+          <w:szCs w:val="24"/>
+          <w:lang w:val="en-GB"/>
+        </w:rPr>
+        <w:t xml:space="preserve"> low-cost, energy-efficient components for occupancy-based automation</w:t>
+      </w:r>
+      <w:r>
+        <w:rPr>
+          <w:rFonts w:ascii="Aptos" w:hAnsi="Aptos" w:eastAsia="Aptos" w:cs="Aptos"/>
+          <w:noProof w:val="0"/>
+          <w:sz w:val="24"/>
+          <w:szCs w:val="24"/>
+          <w:lang w:val="en-GB"/>
+        </w:rPr>
+        <w:t>.</w:t>
+      </w:r>
+      <w:r>
+        <w:rPr>
+          <w:rFonts w:ascii="Aptos" w:hAnsi="Aptos" w:eastAsia="Aptos" w:cs="Aptos"/>
+          <w:noProof w:val="0"/>
+          <w:sz w:val="24"/>
+          <w:szCs w:val="24"/>
+          <w:lang w:val="en-GB"/>
+        </w:rPr>
+        <w:t xml:space="preserve"> </w:t>
+      </w:r>
+    </w:p>
+    <w:p>
+      <w:pPr>
+        <w:pStyle w:val="Normal"/>
         <w:spacing w:before="240" w:beforeAutospacing="off" w:after="240" w:afterAutospacing="off"/>
         <w:jc w:val="left"/>
-        <w:rPr>
-          <w:rFonts w:ascii="Aptos" w:hAnsi="Aptos" w:eastAsia="Aptos" w:cs="Aptos"/>
-          <w:b w:val="1"/>
-          <w:bCs w:val="1"/>
-          <w:noProof w:val="0"/>
-          <w:color w:val="auto"/>
-          <w:sz w:val="36"/>
-          <w:szCs w:val="36"/>
-          <w:lang w:val="en-GB"/>
-        </w:rPr>
-      </w:pPr>
-      <w:r>
-        <w:rPr>
-          <w:rFonts w:ascii="Aptos" w:hAnsi="Aptos" w:eastAsia="Aptos" w:cs="Aptos"/>
-          <w:b w:val="1"/>
-          <w:bCs w:val="1"/>
-          <w:noProof w:val="0"/>
-          <w:color w:val="auto"/>
-          <w:sz w:val="36"/>
-          <w:szCs w:val="36"/>
-          <w:lang w:val="en-GB"/>
-        </w:rPr>
-        <w:t xml:space="preserve">Section 2.5 — Sensor Technologies: DHT22, PIR, Relay </w:t>
+      </w:pPr>
+      <w:r>
+        <w:rPr>
+          <w:rFonts w:ascii="Aptos" w:hAnsi="Aptos" w:eastAsia="Aptos" w:cs="Aptos"/>
+          <w:noProof w:val="0"/>
+          <w:sz w:val="24"/>
+          <w:szCs w:val="24"/>
+          <w:lang w:val="en-GB"/>
+        </w:rPr>
+        <w:t xml:space="preserve">The relay module acts as an interface between the Raspberry Pi’s low-voltage control signals and high-voltage household appliances, functioning as an electrically controlled switch that enables digital signals to safely control mains-voltage </w:t>
+      </w:r>
+      <w:r>
+        <w:rPr>
+          <w:rFonts w:ascii="Aptos" w:hAnsi="Aptos" w:eastAsia="Aptos" w:cs="Aptos"/>
+          <w:noProof w:val="0"/>
+          <w:sz w:val="24"/>
+          <w:szCs w:val="24"/>
+          <w:lang w:val="en-GB"/>
+        </w:rPr>
+        <w:t>circuits.</w:t>
+      </w:r>
+      <w:r>
+        <w:rPr>
+          <w:rFonts w:ascii="Aptos" w:hAnsi="Aptos" w:eastAsia="Aptos" w:cs="Aptos"/>
+          <w:noProof w:val="0"/>
+          <w:sz w:val="24"/>
+          <w:szCs w:val="24"/>
+          <w:lang w:val="en-GB"/>
+        </w:rPr>
+        <w:t xml:space="preserve"> Mathe et al. (2024) document relay use across </w:t>
+      </w:r>
+      <w:r>
+        <w:rPr>
+          <w:rFonts w:ascii="Aptos" w:hAnsi="Aptos" w:eastAsia="Aptos" w:cs="Aptos"/>
+          <w:noProof w:val="0"/>
+          <w:sz w:val="24"/>
+          <w:szCs w:val="24"/>
+          <w:lang w:val="en-GB"/>
+        </w:rPr>
+        <w:t>numerous</w:t>
+      </w:r>
+      <w:r>
+        <w:rPr>
+          <w:rFonts w:ascii="Aptos" w:hAnsi="Aptos" w:eastAsia="Aptos" w:cs="Aptos"/>
+          <w:noProof w:val="0"/>
+          <w:sz w:val="24"/>
+          <w:szCs w:val="24"/>
+          <w:lang w:val="en-GB"/>
+        </w:rPr>
+        <w:t xml:space="preserve"> Raspberry Pi-based home automation implementations, </w:t>
+      </w:r>
+      <w:r>
+        <w:rPr>
+          <w:rFonts w:ascii="Aptos" w:hAnsi="Aptos" w:eastAsia="Aptos" w:cs="Aptos"/>
+          <w:noProof w:val="0"/>
+          <w:sz w:val="24"/>
+          <w:szCs w:val="24"/>
+          <w:lang w:val="en-GB"/>
+        </w:rPr>
+        <w:t>identifying</w:t>
+      </w:r>
+      <w:r>
+        <w:rPr>
+          <w:rFonts w:ascii="Aptos" w:hAnsi="Aptos" w:eastAsia="Aptos" w:cs="Aptos"/>
+          <w:noProof w:val="0"/>
+          <w:sz w:val="24"/>
+          <w:szCs w:val="24"/>
+          <w:lang w:val="en-GB"/>
+        </w:rPr>
+        <w:t xml:space="preserve"> it as a standard hardware </w:t>
+      </w:r>
+      <w:r>
+        <w:rPr>
+          <w:rFonts w:ascii="Aptos" w:hAnsi="Aptos" w:eastAsia="Aptos" w:cs="Aptos"/>
+          <w:noProof w:val="0"/>
+          <w:sz w:val="24"/>
+          <w:szCs w:val="24"/>
+          <w:lang w:val="en-GB"/>
+        </w:rPr>
+        <w:t>component</w:t>
+      </w:r>
+      <w:r>
+        <w:rPr>
+          <w:rFonts w:ascii="Aptos" w:hAnsi="Aptos" w:eastAsia="Aptos" w:cs="Aptos"/>
+          <w:noProof w:val="0"/>
+          <w:sz w:val="24"/>
+          <w:szCs w:val="24"/>
+          <w:lang w:val="en-GB"/>
+        </w:rPr>
+        <w:t xml:space="preserve"> for appliance control in both research prototypes and practical deployments. Ezugwu et al. (2025) similarly list relay boards as essential elements of the smart home hardware stack, used to translate digital control commands into physical actuation of devices such as lights, fans, and heating elements. Together with an SG90 servo motor providing additional mechanical actuation, the relay module completes the sense-decide-actuate loop that underpins the thesis system: the DHT22 and PIR sensors gather environmental and occupancy data, Home Assistant processes this input and applies user-defined automation logic, and the relay and servo respond by controlling connected devices accordingly.</w:t>
       </w:r>
     </w:p>
     <w:p>
       <w:pPr>
         <w:spacing w:before="240" w:beforeAutospacing="off" w:after="240" w:afterAutospacing="off"/>
         <w:jc w:val="left"/>
-      </w:pPr>
-      <w:r>
-        <w:rPr>
-          <w:rFonts w:ascii="Aptos" w:hAnsi="Aptos" w:eastAsia="Aptos" w:cs="Aptos"/>
-          <w:b w:val="1"/>
-          <w:bCs w:val="1"/>
-          <w:noProof w:val="0"/>
-          <w:sz w:val="24"/>
-          <w:szCs w:val="24"/>
-          <w:lang w:val="en-GB"/>
-        </w:rPr>
-        <w:t>DHT22 temperature and humidity sensor</w:t>
-      </w:r>
-    </w:p>
-    <w:p>
-      <w:pPr>
-        <w:spacing w:before="240" w:beforeAutospacing="off" w:after="240" w:afterAutospacing="off"/>
-        <w:jc w:val="left"/>
-      </w:pPr>
-      <w:r>
-        <w:rPr>
-          <w:rFonts w:ascii="Aptos" w:hAnsi="Aptos" w:eastAsia="Aptos" w:cs="Aptos"/>
-          <w:noProof w:val="0"/>
-          <w:sz w:val="24"/>
-          <w:szCs w:val="24"/>
-          <w:lang w:val="en-GB"/>
-        </w:rPr>
-        <w:t>Khan et al. (2024) deployed DHT sensors on a Raspberry Pi device to collect indoor temperature and humidity data at hourly intervals as part of a predictive energy optimisation framework. The DHT sensor combines a thermistor for temperature measurement with a capacitative element for humidity detection. The collected data was used to train deep learning models — including LSTM, RNN, and GRU networks — to predict environmental conditions and energy consumption one time-step ahead, enabling proactive rather than reactive control of heating and cooling actuators. Ezugwu et al. (2025) classify DHT22 as an environmental sensor used for measuring humidity and temperature in smart home contexts, noting it as an improved alternative to the DHT11 with greater accuracy. In the system developed for this thesis, two DHT22 sensors are deployed — one indoors and one to monitor ambient conditions — providing the environmental data that drives Home Assistant automations for fan and ventilation control.</w:t>
-      </w:r>
-    </w:p>
-    <w:p>
-      <w:pPr>
-        <w:spacing w:before="240" w:beforeAutospacing="off" w:after="240" w:afterAutospacing="off"/>
-        <w:jc w:val="left"/>
-      </w:pPr>
-      <w:r>
-        <w:rPr>
-          <w:rFonts w:ascii="Aptos" w:hAnsi="Aptos" w:eastAsia="Aptos" w:cs="Aptos"/>
-          <w:b w:val="1"/>
-          <w:bCs w:val="1"/>
-          <w:noProof w:val="0"/>
-          <w:sz w:val="24"/>
-          <w:szCs w:val="24"/>
-          <w:lang w:val="en-GB"/>
-        </w:rPr>
-        <w:t>PIR motion sensor</w:t>
-      </w:r>
-    </w:p>
-    <w:p>
-      <w:pPr>
-        <w:spacing w:before="240" w:beforeAutospacing="off" w:after="240" w:afterAutospacing="off"/>
-        <w:jc w:val="left"/>
-      </w:pPr>
-      <w:r>
-        <w:rPr>
-          <w:rFonts w:ascii="Aptos" w:hAnsi="Aptos" w:eastAsia="Aptos" w:cs="Aptos"/>
-          <w:noProof w:val="0"/>
-          <w:sz w:val="24"/>
-          <w:szCs w:val="24"/>
-          <w:lang w:val="en-GB"/>
-        </w:rPr>
-        <w:t>Gagote et al. (2026) present a PIR-based automatic lighting system designed to detect human motion and activate LED outputs without a microcontroller, demonstrating that the sensor can directly control a circuit through motion detection alone. The PIR sensor works by detecting changes in infrared radiation emitted by the human body — when a person enters the detection zone, the sensor triggers a response. In their prototype, the system successfully detected motion within its effective indoor range with minimal delay, and showed consistent performance for lighting automation applications. Limitations noted include sensitivity to environmental temperature changes and a restricted detection range. Ezugwu et al. (2025) categorise the HC-SR501 PIR as an environmental sensor used for motion detection and home monitoring, noting its use for safety and security through detection and alarm triggering. In the thesis project, the PIR sensor is connected to the Raspberry Pi GPIO pins, allowing Home Assistant to trigger automations — such as activating a relay-controlled device — whenever occupancy is detected.</w:t>
-      </w:r>
-    </w:p>
-    <w:p>
-      <w:pPr>
-        <w:spacing w:before="240" w:beforeAutospacing="off" w:after="240" w:afterAutospacing="off"/>
-        <w:jc w:val="left"/>
-      </w:pPr>
-      <w:r>
-        <w:rPr>
-          <w:rFonts w:ascii="Aptos" w:hAnsi="Aptos" w:eastAsia="Aptos" w:cs="Aptos"/>
-          <w:b w:val="1"/>
-          <w:bCs w:val="1"/>
-          <w:noProof w:val="0"/>
-          <w:sz w:val="24"/>
-          <w:szCs w:val="24"/>
-          <w:lang w:val="en-GB"/>
-        </w:rPr>
-        <w:t>Relay module and the sense-decide-actuate loop</w:t>
-      </w:r>
-    </w:p>
-    <w:p>
-      <w:pPr>
-        <w:spacing w:before="240" w:beforeAutospacing="off" w:after="240" w:afterAutospacing="off"/>
-        <w:jc w:val="left"/>
-      </w:pPr>
-      <w:r>
-        <w:rPr>
-          <w:rFonts w:ascii="Aptos" w:hAnsi="Aptos" w:eastAsia="Aptos" w:cs="Aptos"/>
-          <w:noProof w:val="0"/>
-          <w:sz w:val="24"/>
-          <w:szCs w:val="24"/>
-          <w:lang w:val="en-GB"/>
-        </w:rPr>
-        <w:t xml:space="preserve">Mathe et al. (2024) provide a comprehensive review of Raspberry Pi applications in home automation, </w:t>
-      </w:r>
-      <w:r>
-        <w:rPr>
-          <w:rFonts w:ascii="Aptos" w:hAnsi="Aptos" w:eastAsia="Aptos" w:cs="Aptos"/>
-          <w:noProof w:val="0"/>
-          <w:sz w:val="24"/>
-          <w:szCs w:val="24"/>
-          <w:lang w:val="en-GB"/>
-        </w:rPr>
-        <w:t>identifying</w:t>
-      </w:r>
-      <w:r>
-        <w:rPr>
-          <w:rFonts w:ascii="Aptos" w:hAnsi="Aptos" w:eastAsia="Aptos" w:cs="Aptos"/>
-          <w:noProof w:val="0"/>
-          <w:sz w:val="24"/>
-          <w:szCs w:val="24"/>
-          <w:lang w:val="en-GB"/>
-        </w:rPr>
-        <w:t xml:space="preserve"> relay modules as standard components for controlling household appliances from a low-voltage microcontroller signal. Their review documents relay use across </w:t>
-      </w:r>
-      <w:r>
-        <w:rPr>
-          <w:rFonts w:ascii="Aptos" w:hAnsi="Aptos" w:eastAsia="Aptos" w:cs="Aptos"/>
-          <w:noProof w:val="0"/>
-          <w:sz w:val="24"/>
-          <w:szCs w:val="24"/>
-          <w:lang w:val="en-GB"/>
-        </w:rPr>
-        <w:t>numerous</w:t>
-      </w:r>
-      <w:r>
-        <w:rPr>
-          <w:rFonts w:ascii="Aptos" w:hAnsi="Aptos" w:eastAsia="Aptos" w:cs="Aptos"/>
-          <w:noProof w:val="0"/>
-          <w:sz w:val="24"/>
-          <w:szCs w:val="24"/>
-          <w:lang w:val="en-GB"/>
-        </w:rPr>
-        <w:t xml:space="preserve"> automation studies, where the relay acts as an electrically operated switch — allowing the Raspberry Pi to turn on or off mains-voltage devices safely. Ezugwu et al. (2025) similarly document relay modules as core hardware in smart home automation systems, noting that they are essential for translating digital control signals into physical actuation of appliances such as lights, fans, and heating elements. In the system developed for this thesis, the relay module connects to the Raspberry Pi and is controlled through Home Assistant, while an SG90 servo provides </w:t>
-      </w:r>
-      <w:r>
-        <w:rPr>
-          <w:rFonts w:ascii="Aptos" w:hAnsi="Aptos" w:eastAsia="Aptos" w:cs="Aptos"/>
-          <w:noProof w:val="0"/>
-          <w:sz w:val="24"/>
-          <w:szCs w:val="24"/>
-          <w:lang w:val="en-GB"/>
-        </w:rPr>
-        <w:t>additional</w:t>
-      </w:r>
-      <w:r>
-        <w:rPr>
-          <w:rFonts w:ascii="Aptos" w:hAnsi="Aptos" w:eastAsia="Aptos" w:cs="Aptos"/>
-          <w:noProof w:val="0"/>
-          <w:sz w:val="24"/>
-          <w:szCs w:val="24"/>
-          <w:lang w:val="en-GB"/>
-        </w:rPr>
-        <w:t xml:space="preserve"> physical actuation — for example, triggering a mechanical lock or vent. Together, the DHT22, PIR, relay, and servo form a complete sense-decide-actuate loop: the sensors gather data, Home Assistant processes it and applies automation logic, and the actuators respond accordingly.</w:t>
-      </w:r>
+        <w:rPr>
+          <w:rFonts w:ascii="Aptos" w:hAnsi="Aptos" w:eastAsia="Aptos" w:cs="Aptos"/>
+          <w:noProof w:val="0"/>
+          <w:sz w:val="24"/>
+          <w:szCs w:val="24"/>
+          <w:lang w:val="en-GB"/>
+        </w:rPr>
+      </w:pPr>
     </w:p>
     <w:p>
       <w:pPr>
@@ -7617,7 +7194,7 @@
         </w:rPr>
         <w:t xml:space="preserve"> home automation. </w:t>
       </w:r>
-      <w:hyperlink r:id="Rf39135aed1844641">
+      <w:hyperlink r:id="Rca0a40c1dad54333">
         <w:r>
           <w:rPr>
             <w:rStyle w:val="Hyperlink"/>
@@ -7675,7 +7252,7 @@
         </w:rPr>
         <w:t xml:space="preserve">, D. (2025). Overview of smart home security with Raspberry Pi. Proceedings of ICISS '24, 163–169. </w:t>
       </w:r>
-      <w:hyperlink r:id="R98202474b059481b">
+      <w:hyperlink r:id="R036e3b9e7dac4731">
         <w:r>
           <w:rPr>
             <w:rFonts w:ascii="Times New Roman" w:hAnsi="Times New Roman" w:eastAsia="Times New Roman" w:cs="Times New Roman"/>
@@ -7737,7 +7314,7 @@
         </w:rPr>
         <w:t xml:space="preserve">. </w:t>
       </w:r>
-      <w:hyperlink r:id="Rbb124321947245e9">
+      <w:hyperlink r:id="R05f534e933fc4de3">
         <w:r>
           <w:rPr>
             <w:rStyle w:val="Hyperlink"/>
@@ -7778,7 +7355,7 @@
         </w:rPr>
         <w:t xml:space="preserve">Evans, P. J. (2025). DIY home automation with Raspberry Pi. Raspberry Pi Foundation. </w:t>
       </w:r>
-      <w:hyperlink r:id="Raddd7daa0fcf4d2d">
+      <w:hyperlink r:id="Raddf6ad9f1b84ecf">
         <w:r>
           <w:rPr>
             <w:rStyle w:val="Hyperlink"/>
@@ -7879,7 +7456,7 @@
         </w:rPr>
         <w:t xml:space="preserve">, N. K. (2024). A comprehensive review on applications of Raspberry Pi. Computer Science Review, 52, 100636. </w:t>
       </w:r>
-      <w:hyperlink r:id="Raaf4789c637041e6">
+      <w:hyperlink r:id="R668543ba5d61418d">
         <w:r>
           <w:rPr>
             <w:rStyle w:val="Hyperlink"/>
@@ -7902,47 +7479,79 @@
         </w:numPr>
         <w:spacing w:before="240" w:beforeAutospacing="off" w:after="240" w:afterAutospacing="off"/>
         <w:jc w:val="left"/>
-        <w:rPr/>
-      </w:pPr>
-      <w:r>
-        <w:rPr>
-          <w:noProof w:val="0"/>
-          <w:lang w:val="en-GB"/>
-        </w:rPr>
-        <w:t xml:space="preserve">Gagote, E. O., </w:t>
-      </w:r>
-      <w:r>
-        <w:rPr>
-          <w:noProof w:val="0"/>
+        <w:rPr>
+          <w:rFonts w:ascii="Times New Roman" w:hAnsi="Times New Roman" w:eastAsia="Times New Roman" w:cs="Times New Roman"/>
+          <w:sz w:val="22"/>
+          <w:szCs w:val="22"/>
+        </w:rPr>
+      </w:pPr>
+      <w:r>
+        <w:rPr>
+          <w:rFonts w:ascii="Times New Roman" w:hAnsi="Times New Roman" w:eastAsia="Times New Roman" w:cs="Times New Roman"/>
+          <w:noProof w:val="0"/>
+          <w:sz w:val="22"/>
+          <w:szCs w:val="22"/>
+          <w:lang w:val="en-GB"/>
+        </w:rPr>
+        <w:t>Gagote</w:t>
+      </w:r>
+      <w:r>
+        <w:rPr>
+          <w:rFonts w:ascii="Times New Roman" w:hAnsi="Times New Roman" w:eastAsia="Times New Roman" w:cs="Times New Roman"/>
+          <w:noProof w:val="0"/>
+          <w:sz w:val="22"/>
+          <w:szCs w:val="22"/>
+          <w:lang w:val="en-GB"/>
+        </w:rPr>
+        <w:t xml:space="preserve">, E. O., </w:t>
+      </w:r>
+      <w:r>
+        <w:rPr>
+          <w:rFonts w:ascii="Times New Roman" w:hAnsi="Times New Roman" w:eastAsia="Times New Roman" w:cs="Times New Roman"/>
+          <w:noProof w:val="0"/>
+          <w:sz w:val="22"/>
+          <w:szCs w:val="22"/>
           <w:lang w:val="en-GB"/>
         </w:rPr>
         <w:t>Gapol</w:t>
       </w:r>
       <w:r>
         <w:rPr>
-          <w:noProof w:val="0"/>
+          <w:rFonts w:ascii="Times New Roman" w:hAnsi="Times New Roman" w:eastAsia="Times New Roman" w:cs="Times New Roman"/>
+          <w:noProof w:val="0"/>
+          <w:sz w:val="22"/>
+          <w:szCs w:val="22"/>
           <w:lang w:val="en-GB"/>
         </w:rPr>
         <w:t xml:space="preserve">, K. J. D., Murillo, S. K. G., Velasquez, H. U., &amp; Fabro, M. N. (2026). </w:t>
       </w:r>
       <w:r>
         <w:rPr>
-          <w:noProof w:val="0"/>
+          <w:rFonts w:ascii="Times New Roman" w:hAnsi="Times New Roman" w:eastAsia="Times New Roman" w:cs="Times New Roman"/>
+          <w:noProof w:val="0"/>
+          <w:sz w:val="22"/>
+          <w:szCs w:val="22"/>
           <w:lang w:val="en-GB"/>
         </w:rPr>
         <w:t>Autolight</w:t>
       </w:r>
       <w:r>
         <w:rPr>
-          <w:noProof w:val="0"/>
+          <w:rFonts w:ascii="Times New Roman" w:hAnsi="Times New Roman" w:eastAsia="Times New Roman" w:cs="Times New Roman"/>
+          <w:noProof w:val="0"/>
+          <w:sz w:val="22"/>
+          <w:szCs w:val="22"/>
           <w:lang w:val="en-GB"/>
         </w:rPr>
         <w:t xml:space="preserve">: Smart motion detection lighting system (passive infrared sensor). International Journal of Research and Scientific Innovation, 13(1), 611–621. </w:t>
       </w:r>
-      <w:hyperlink r:id="R465643983c5c42d8">
+      <w:hyperlink r:id="R6e5eb5ad3ab742f8">
         <w:r>
           <w:rPr>
+            <w:rFonts w:ascii="Times New Roman" w:hAnsi="Times New Roman" w:eastAsia="Times New Roman" w:cs="Times New Roman"/>
             <w:noProof w:val="0"/>
+            <w:sz w:val="22"/>
+            <w:szCs w:val="22"/>
             <w:lang w:val="en-GB"/>
           </w:rPr>
           <w:t>https://doi.org/10.51244/IJRSI.2026.13010052</w:t>
@@ -7958,7 +7567,10 @@
         </w:numPr>
         <w:spacing w:before="240" w:beforeAutospacing="off" w:after="240" w:afterAutospacing="off"/>
         <w:rPr>
-          <w:noProof w:val="0"/>
+          <w:rFonts w:ascii="Times New Roman" w:hAnsi="Times New Roman" w:eastAsia="Times New Roman" w:cs="Times New Roman"/>
+          <w:noProof w:val="0"/>
+          <w:sz w:val="22"/>
+          <w:szCs w:val="22"/>
           <w:lang w:val="en-GB"/>
         </w:rPr>
       </w:pPr>
@@ -8021,6 +7633,91 @@
 
 <file path=word/numbering.xml><?xml version="1.0" encoding="utf-8"?>
 <w:numbering xmlns:w="http://schemas.openxmlformats.org/wordprocessingml/2006/main">
+  <w:abstractNum xmlns:w="http://schemas.openxmlformats.org/wordprocessingml/2006/main" w:abstractNumId="11">
+    <w:nsid w:val="2e473c0"/>
+    <w:multiLevelType xmlns:w="http://schemas.openxmlformats.org/wordprocessingml/2006/main" w:val="hybridMultilevel"/>
+    <w:lvl xmlns:w="http://schemas.openxmlformats.org/wordprocessingml/2006/main" w:ilvl="0">
+      <w:start w:val="1"/>
+      <w:numFmt w:val="decimal"/>
+      <w:lvlText w:val="%1."/>
+      <w:lvlJc w:val="left"/>
+      <w:pPr>
+        <w:ind w:left="720" w:hanging="360"/>
+      </w:pPr>
+    </w:lvl>
+    <w:lvl xmlns:w="http://schemas.openxmlformats.org/wordprocessingml/2006/main" w:ilvl="1">
+      <w:start w:val="1"/>
+      <w:numFmt w:val="lowerLetter"/>
+      <w:lvlText w:val="%2."/>
+      <w:lvlJc w:val="left"/>
+      <w:pPr>
+        <w:ind w:left="1440" w:hanging="360"/>
+      </w:pPr>
+    </w:lvl>
+    <w:lvl xmlns:w="http://schemas.openxmlformats.org/wordprocessingml/2006/main" w:ilvl="2">
+      <w:start w:val="1"/>
+      <w:numFmt w:val="lowerRoman"/>
+      <w:lvlText w:val="%3."/>
+      <w:lvlJc w:val="right"/>
+      <w:pPr>
+        <w:ind w:left="2160" w:hanging="180"/>
+      </w:pPr>
+    </w:lvl>
+    <w:lvl xmlns:w="http://schemas.openxmlformats.org/wordprocessingml/2006/main" w:ilvl="3">
+      <w:start w:val="1"/>
+      <w:numFmt w:val="decimal"/>
+      <w:lvlText w:val="%4."/>
+      <w:lvlJc w:val="left"/>
+      <w:pPr>
+        <w:ind w:left="2880" w:hanging="360"/>
+      </w:pPr>
+    </w:lvl>
+    <w:lvl xmlns:w="http://schemas.openxmlformats.org/wordprocessingml/2006/main" w:ilvl="4">
+      <w:start w:val="1"/>
+      <w:numFmt w:val="lowerLetter"/>
+      <w:lvlText w:val="%5."/>
+      <w:lvlJc w:val="left"/>
+      <w:pPr>
+        <w:ind w:left="3600" w:hanging="360"/>
+      </w:pPr>
+    </w:lvl>
+    <w:lvl xmlns:w="http://schemas.openxmlformats.org/wordprocessingml/2006/main" w:ilvl="5">
+      <w:start w:val="1"/>
+      <w:numFmt w:val="lowerRoman"/>
+      <w:lvlText w:val="%6."/>
+      <w:lvlJc w:val="right"/>
+      <w:pPr>
+        <w:ind w:left="4320" w:hanging="180"/>
+      </w:pPr>
+    </w:lvl>
+    <w:lvl xmlns:w="http://schemas.openxmlformats.org/wordprocessingml/2006/main" w:ilvl="6">
+      <w:start w:val="1"/>
+      <w:numFmt w:val="decimal"/>
+      <w:lvlText w:val="%7."/>
+      <w:lvlJc w:val="left"/>
+      <w:pPr>
+        <w:ind w:left="5040" w:hanging="360"/>
+      </w:pPr>
+    </w:lvl>
+    <w:lvl xmlns:w="http://schemas.openxmlformats.org/wordprocessingml/2006/main" w:ilvl="7">
+      <w:start w:val="1"/>
+      <w:numFmt w:val="lowerLetter"/>
+      <w:lvlText w:val="%8."/>
+      <w:lvlJc w:val="left"/>
+      <w:pPr>
+        <w:ind w:left="5760" w:hanging="360"/>
+      </w:pPr>
+    </w:lvl>
+    <w:lvl xmlns:w="http://schemas.openxmlformats.org/wordprocessingml/2006/main" w:ilvl="8">
+      <w:start w:val="1"/>
+      <w:numFmt w:val="lowerRoman"/>
+      <w:lvlText w:val="%9."/>
+      <w:lvlJc w:val="right"/>
+      <w:pPr>
+        <w:ind w:left="6480" w:hanging="180"/>
+      </w:pPr>
+    </w:lvl>
+  </w:abstractNum>
   <w:abstractNum xmlns:w="http://schemas.openxmlformats.org/wordprocessingml/2006/main" w:abstractNumId="10">
     <w:nsid w:val="7ada6295"/>
     <w:multiLevelType xmlns:w="http://schemas.openxmlformats.org/wordprocessingml/2006/main" w:val="hybridMultilevel"/>
@@ -9087,6 +8784,9 @@
       </w:rPr>
     </w:lvl>
   </w:abstractNum>
+  <w:num w:numId="11">
+    <w:abstractNumId w:val="11"/>
+  </w:num>
   <w:num w:numId="10">
     <w:abstractNumId w:val="10"/>
   </w:num>
@@ -9592,7 +9292,7 @@
     <w:next w:val="Normal"/>
     <w:unhideWhenUsed/>
     <w:qFormat/>
-    <w:rsid w:val="5B2FF46B"/>
+    <w:rsid w:val="3C7ECAD0"/>
     <w:rPr>
       <w:rFonts w:eastAsia="" w:cs="" w:eastAsiaTheme="majorEastAsia" w:cstheme="majorBidi"/>
       <w:color w:val="0F4761" w:themeColor="accent1" w:themeTint="FF" w:themeShade="BF"/>

</xml_diff>